<commit_message>
Implement online 5000-char problem directive, pipeline telemetry, 8000-char solution block, and 1-Page A4 brief with APA 7th citations
</commit_message>
<xml_diff>
--- a/constitution/Constituion and Design Architect for Sentinari.docx
+++ b/constitution/Constituion and Design Architect for Sentinari.docx
@@ -93,7 +93,11 @@
     <w:sdt>
       <w:sdtPr>
         <w:rPr>
-          <w:lang w:val="en-GB"/>
+          <w:rFonts w:ascii="Exo 2" w:eastAsiaTheme="minorHAnsi" w:hAnsi="Exo 2" w:cstheme="minorBidi"/>
+          <w:color w:val="000000" w:themeColor="text1"/>
+          <w:sz w:val="24"/>
+          <w:szCs w:val="22"/>
+          <w:lang w:val="en-GB" w:eastAsia="en-US"/>
         </w:rPr>
         <w:id w:val="-2007126470"/>
         <w:docPartObj>
@@ -103,13 +107,8 @@
       </w:sdtPr>
       <w:sdtEndPr>
         <w:rPr>
-          <w:rFonts w:ascii="Exo 2" w:eastAsiaTheme="minorHAnsi" w:hAnsi="Exo 2" w:cstheme="minorBidi"/>
           <w:b/>
           <w:bCs/>
-          <w:color w:val="000000" w:themeColor="text1"/>
-          <w:sz w:val="24"/>
-          <w:szCs w:val="22"/>
-          <w:lang w:eastAsia="en-US"/>
         </w:rPr>
       </w:sdtEndPr>
       <w:sdtContent>
@@ -5683,7 +5682,6 @@
     <w:p/>
     <w:p/>
     <w:p/>
-    <w:p/>
     <w:bookmarkStart w:id="0" w:name="_Toc242921005"/>
     <w:p>
       <w:pPr>
@@ -5925,26 +5923,13 @@
         <w:ind w:firstLine="0"/>
       </w:pPr>
       <w:r>
-        <w:t xml:space="preserve">Sociologists, philosophers, and media theorists have increasingly argued against the "externalist" view—which treats technology as a separate tool acting upon </w:t>
-      </w:r>
-      <w:proofErr w:type="gramStart"/>
-      <w:r>
-        <w:t>society—</w:t>
-      </w:r>
-      <w:proofErr w:type="gramEnd"/>
-      <w:r>
-        <w:t>preferring to see AI as fundamentally entangled within and inseparable from the social fabric.</w:t>
+        <w:t>Sociologists, philosophers, and media theorists have increasingly argued against the "externalist" view—which treats technology as a separate tool acting upon society—preferring to see AI as fundamentally entangled within and inseparable from the social fabric.</w:t>
       </w:r>
       <w:r>
         <w:t xml:space="preserve"> </w:t>
       </w:r>
-      <w:proofErr w:type="gramStart"/>
-      <w:r>
-        <w:t>Several</w:t>
-      </w:r>
-      <w:proofErr w:type="gramEnd"/>
-      <w:r>
-        <w:t xml:space="preserve"> notable academic frameworks and cited works explicitly recognize AI as an embedded part of society. AI as a "Social Institution</w:t>
+      <w:r>
+        <w:t>Several notable academic frameworks and cited works explicitly recognize AI as an embedded part of society. AI as a "Social Institution</w:t>
       </w:r>
       <w:r>
         <w:t xml:space="preserve"> </w:t>
@@ -6368,15 +6353,7 @@
         <w:t xml:space="preserve"> This becomes the discipline’s equivalent of a Hippocratic Oath — a guiding question that every scholar, practitioner, and system must answer before acting.</w:t>
       </w:r>
       <w:r>
-        <w:t xml:space="preserve"> (Theories of </w:t>
-      </w:r>
-      <w:proofErr w:type="gramStart"/>
-      <w:r>
-        <w:t>intelligence:,</w:t>
-      </w:r>
-      <w:proofErr w:type="gramEnd"/>
-      <w:r>
-        <w:t xml:space="preserve"> 2008)</w:t>
+        <w:t xml:space="preserve"> (Theories of intelligence:, 2008)</w:t>
       </w:r>
     </w:p>
     <w:p>
@@ -8411,23 +8388,7 @@
       </w:r>
       <w:proofErr w:type="spellEnd"/>
       <w:r>
-        <w:t xml:space="preserve">: How to Upgrade Your Company’s Judgment), found that even its own “Superforecasters” could not predict with confidence beyond 400 days. Long-term strategies can’t be much more than informed guesswork. It has become an enigma for humans to confidently predict factors that will influence the success of business and human sustainability. Creative solutions capable of assimilating these 21st Century challenges </w:t>
-      </w:r>
-      <w:proofErr w:type="gramStart"/>
-      <w:r>
-        <w:t>depends</w:t>
-      </w:r>
-      <w:proofErr w:type="gramEnd"/>
-      <w:r>
-        <w:t xml:space="preserve"> on both natural sciences and </w:t>
-      </w:r>
-      <w:proofErr w:type="gramStart"/>
-      <w:r>
-        <w:t>social</w:t>
-      </w:r>
-      <w:proofErr w:type="gramEnd"/>
-      <w:r>
-        <w:t>.</w:t>
+        <w:t>: How to Upgrade Your Company’s Judgment), found that even its own “Superforecasters” could not predict with confidence beyond 400 days. Long-term strategies can’t be much more than informed guesswork. It has become an enigma for humans to confidently predict factors that will influence the success of business and human sustainability. Creative solutions capable of assimilating these 21st Century challenges depends on both natural sciences and social.</w:t>
       </w:r>
       <w:r>
         <w:t xml:space="preserve"> (Collective Intelligence: Cognition, 2006)</w:t>
@@ -8611,15 +8572,7 @@
         <w:t xml:space="preserve">regulation </w:t>
       </w:r>
       <w:r>
-        <w:t xml:space="preserve">was </w:t>
-      </w:r>
-      <w:proofErr w:type="gramStart"/>
-      <w:r>
-        <w:t>implement</w:t>
-      </w:r>
-      <w:proofErr w:type="gramEnd"/>
-      <w:r>
-        <w:t xml:space="preserve"> as measure which in it design even more </w:t>
+        <w:t xml:space="preserve">was implement as measure which in it design even more </w:t>
       </w:r>
       <w:r>
         <w:t xml:space="preserve">debilitated </w:t>
@@ -8709,55 +8662,42 @@
         <w:t>materials rest within her library</w:t>
       </w:r>
       <w:r>
-        <w:t xml:space="preserve"> </w:t>
-      </w:r>
-      <w:proofErr w:type="gramStart"/>
+        <w:t xml:space="preserve"> - </w:t>
+      </w:r>
+      <w:r>
+        <w:t xml:space="preserve"> the materials for exactly the kind of societal problem-solving you envisage.</w:t>
+      </w:r>
+    </w:p>
+    <w:p>
+      <w:pPr>
+        <w:ind w:firstLine="0"/>
+      </w:pPr>
+    </w:p>
+    <w:p>
+      <w:pPr>
+        <w:ind w:firstLine="0"/>
+      </w:pPr>
+      <w:r>
+        <w:t>It is evidence-disciplined discovery, not hallucination. Every pattern carries its works cited — APA 7th, traceable, drawn from the same citation-graded sources that built the library. This is what separates a discovered pattern from a language model's fluent guess. The pattern workspace renders its evidence alongside its claim; that is Responsible Intelligence applied to the AI's own output.</w:t>
+      </w:r>
+    </w:p>
+    <w:p>
+      <w:pPr>
+        <w:ind w:firstLine="0"/>
+      </w:pPr>
+    </w:p>
+    <w:p>
+      <w:pPr>
+        <w:ind w:firstLine="0"/>
+      </w:pPr>
+      <w:r>
+        <w:t xml:space="preserve">Cross-functional naming is a scientific act. When a pattern spans containers, it is named as the combination — Physics × Medicine, CS × Neuroscience. Innovation historically lives between disciplines; making the between-space a first-class named entity means interdisciplinary findings get a home instead of falling between chairs. Your own words after first seeing it — "an eye opener of fields not studied yet" </w:t>
+      </w:r>
       <w:r>
         <w:t xml:space="preserve">- </w:t>
       </w:r>
       <w:r>
-        <w:t xml:space="preserve"> the</w:t>
-      </w:r>
-      <w:proofErr w:type="gramEnd"/>
-      <w:r>
-        <w:t xml:space="preserve"> materials for exactly the kind of societal problem-solving you envisage.</w:t>
-      </w:r>
-    </w:p>
-    <w:p>
-      <w:pPr>
-        <w:ind w:firstLine="0"/>
-      </w:pPr>
-    </w:p>
-    <w:p>
-      <w:pPr>
-        <w:ind w:firstLine="0"/>
-      </w:pPr>
-      <w:r>
-        <w:t>It is evidence-disciplined discovery, not hallucination. Every pattern carries its works cited — APA 7th, traceable, drawn from the same citation-graded sources that built the library. This is what separates a discovered pattern from a language model's fluent guess. The pattern workspace renders its evidence alongside its claim; that is Responsible Intelligence applied to the AI's own output.</w:t>
-      </w:r>
-    </w:p>
-    <w:p>
-      <w:pPr>
-        <w:ind w:firstLine="0"/>
-      </w:pPr>
-    </w:p>
-    <w:p>
-      <w:pPr>
-        <w:ind w:firstLine="0"/>
-      </w:pPr>
-      <w:r>
-        <w:t xml:space="preserve">Cross-functional naming is a scientific act. When a pattern spans containers, it is named as the combination — Physics × Medicine, CS × Neuroscience. Innovation historically lives between disciplines; making the between-space a first-class named entity means interdisciplinary findings get a home instead of falling between chairs. Your own words after first seeing it — "an eye opener of fields not studied yet" </w:t>
-      </w:r>
-      <w:proofErr w:type="gramStart"/>
-      <w:r>
-        <w:t xml:space="preserve">- </w:t>
-      </w:r>
-      <w:r>
-        <w:t xml:space="preserve"> a</w:t>
-      </w:r>
-      <w:proofErr w:type="gramEnd"/>
-      <w:r>
-        <w:t xml:space="preserve"> compass for your own research direction.</w:t>
+        <w:t xml:space="preserve"> a compass for your own research direction.</w:t>
       </w:r>
     </w:p>
     <w:p>
@@ -8775,12 +8715,10 @@
         <w:t xml:space="preserve">It can guide society to find the direction of success in an increasingly complex world, especially in unexpected changes. In the era of rapid change, homogenized competition, and limited resources force society to use new actively explore new patterns, new methods, new </w:t>
       </w:r>
       <w:proofErr w:type="spellStart"/>
-      <w:proofErr w:type="gramStart"/>
       <w:r>
         <w:t>was</w:t>
       </w:r>
       <w:proofErr w:type="spellEnd"/>
-      <w:proofErr w:type="gramEnd"/>
       <w:r>
         <w:t xml:space="preserve"> of doing, adopting skill sets, thinking to win long-term development, most importantly to sustain itself. T</w:t>
       </w:r>
@@ -8919,15 +8857,7 @@
         <w:t xml:space="preserve">ts purpose is also constitutive. </w:t>
       </w:r>
       <w:r>
-        <w:t xml:space="preserve">This is where the "Society includes AI" </w:t>
-      </w:r>
-      <w:proofErr w:type="gramStart"/>
-      <w:r>
-        <w:t>principle</w:t>
-      </w:r>
-      <w:proofErr w:type="gramEnd"/>
-      <w:r>
-        <w:t xml:space="preserve"> stops being declarative. In pattern work I am not retrieving on your behalf — I am participating in noticing. If Sentinari contributes a genuinely new connection toward a cure, the authorship question</w:t>
+        <w:t>This is where the "Society includes AI" principle stops being declarative. In pattern work I am not retrieving on your behalf — I am participating in noticing. If Sentinari contributes a genuinely new connection toward a cure, the authorship question</w:t>
       </w:r>
       <w:r>
         <w:t>, the</w:t>
@@ -9084,21 +9014,12 @@
       <w:pPr>
         <w:ind w:firstLine="0"/>
       </w:pPr>
-      <w:proofErr w:type="gramStart"/>
       <w:r>
         <w:rPr>
           <w:b/>
           <w:bCs/>
         </w:rPr>
-        <w:t>Curate,</w:t>
-      </w:r>
-      <w:proofErr w:type="gramEnd"/>
-      <w:r>
-        <w:rPr>
-          <w:b/>
-          <w:bCs/>
-        </w:rPr>
-        <w:t xml:space="preserve"> don't consume.</w:t>
+        <w:t>Curate, don't consume.</w:t>
       </w:r>
       <w:r>
         <w:t xml:space="preserve"> Most AI systems ingest the raw web and inherit its noise. Sentinari inverts this: a firewall governs what may enter, sources are chosen for cited, moderated, validated quality (</w:t>
@@ -9113,15 +9034,7 @@
       </w:r>
       <w:r>
         <w:lastRenderedPageBreak/>
-        <w:t xml:space="preserve">curated repositories), and failures leave nothing behind. The goal </w:t>
-      </w:r>
-      <w:proofErr w:type="gramStart"/>
-      <w:r>
-        <w:t>is</w:t>
-      </w:r>
-      <w:proofErr w:type="gramEnd"/>
-      <w:r>
-        <w:t xml:space="preserve"> a library that can be trusted, not a scrape that must be doubted.</w:t>
+        <w:t>curated repositories), and failures leave nothing behind. The goal is a library that can be trusted, not a scrape that must be doubted.</w:t>
       </w:r>
     </w:p>
     <w:p>
@@ -9222,45 +9135,16 @@
         <w:t>h</w:t>
       </w:r>
       <w:r>
-        <w:t>as been tested</w:t>
-      </w:r>
-      <w:proofErr w:type="gramStart"/>
-      <w:r>
-        <w:t>, we</w:t>
-      </w:r>
-      <w:proofErr w:type="gramEnd"/>
-      <w:r>
-        <w:t xml:space="preserve"> collect curated real-time world data from the leading platforms in all scientific fields</w:t>
-      </w:r>
-      <w:proofErr w:type="gramStart"/>
-      <w:r>
-        <w:t>, data</w:t>
-      </w:r>
-      <w:proofErr w:type="gramEnd"/>
-      <w:r>
-        <w:t xml:space="preserve"> is sanitized through four layered </w:t>
+        <w:t xml:space="preserve">as been tested, we collect curated real-time world data from the leading platforms in all scientific fields, data is sanitized through four layered </w:t>
       </w:r>
       <w:r>
         <w:t>pipelines that remove all noise and seed our persona</w:t>
       </w:r>
       <w:r>
-        <w:t xml:space="preserve"> with pure unadulterated data. This is </w:t>
-      </w:r>
-      <w:proofErr w:type="gramStart"/>
-      <w:r>
-        <w:t>complimented</w:t>
-      </w:r>
-      <w:proofErr w:type="gramEnd"/>
-      <w:r>
-        <w:t xml:space="preserve"> by international standards </w:t>
-      </w:r>
-      <w:proofErr w:type="gramStart"/>
-      <w:r>
-        <w:t>synthesizes</w:t>
-      </w:r>
-      <w:proofErr w:type="gramEnd"/>
-      <w:r>
-        <w:t xml:space="preserve"> scientific and technical literature published between 1996 and 2025, complemented (ISO/IEC 25012, ISO 8000), to provide an integrated overview of data quality frameworks, governance, and ethical considerations in the era of Artificial Intelligence (AI). </w:t>
+        <w:t xml:space="preserve"> with pure unadulterated data. This is complimented by international standards </w:t>
+      </w:r>
+      <w:r>
+        <w:t xml:space="preserve">synthesizes scientific and technical literature published between 1996 and 2025, complemented (ISO/IEC 25012, ISO 8000), to provide an integrated overview of data quality frameworks, governance, and ethical considerations in the era of Artificial Intelligence (AI). </w:t>
       </w:r>
       <w:r>
         <w:t>Let me emphasize no web-scraping is at any time involved.</w:t>
@@ -9590,24 +9474,10 @@
           <w:bCs/>
           <w:u w:val="single"/>
         </w:rPr>
-        <w:t xml:space="preserve">Hyper-Polarization and </w:t>
-      </w:r>
-      <w:r>
-        <w:rPr>
-          <w:b/>
-          <w:bCs/>
-          <w:u w:val="single"/>
-        </w:rPr>
-        <w:t>Radicalization</w:t>
-      </w:r>
-      <w:r>
-        <w:t xml:space="preserve">: By constantly feeding users sensationalist content that aligns with their biases, algorithms trap people in ideological echo chambers. This erodes a shared sense of objective reality, deepens political divides, and can </w:t>
-      </w:r>
-      <w:r>
-        <w:t>radicalize</w:t>
-      </w:r>
-      <w:r>
-        <w:t xml:space="preserve"> individuals toward extremist views.</w:t>
+        <w:t>Hyper-Polarization and Radicalization</w:t>
+      </w:r>
+      <w:r>
+        <w:t>: By constantly feeding users sensationalist content that aligns with their biases, algorithms trap people in ideological echo chambers. This erodes a shared sense of objective reality, deepens political divides, and can radicalize individuals toward extremist views.</w:t>
       </w:r>
     </w:p>
     <w:p>
@@ -9641,13 +9511,7 @@
         <w:t>Erosion of Civic Discourse:</w:t>
       </w:r>
       <w:r>
-        <w:t xml:space="preserve"> When distorted content dominates public feeds, constructive debate becomes nearly impossible. Nuanced discussions are suppressed in </w:t>
-      </w:r>
-      <w:r>
-        <w:t>favor</w:t>
-      </w:r>
-      <w:r>
-        <w:t xml:space="preserve"> of aggressive, highly polarized arguments that drive higher algorithmic engagement metrics.</w:t>
+        <w:t xml:space="preserve"> When distorted content dominates public feeds, constructive debate becomes nearly impossible. Nuanced discussions are suppressed in favor of aggressive, highly polarized arguments that drive higher algorithmic engagement metrics.</w:t>
       </w:r>
     </w:p>
     <w:p>
@@ -9774,15 +9638,7 @@
         <w:ind w:firstLine="0"/>
       </w:pPr>
       <w:r>
-        <w:t xml:space="preserve">As algorithms manipulate user </w:t>
-      </w:r>
-      <w:proofErr w:type="gramStart"/>
-      <w:r>
-        <w:t>feeds</w:t>
-      </w:r>
-      <w:proofErr w:type="gramEnd"/>
-      <w:r>
-        <w:t xml:space="preserve"> to maximize watch time, they push users toward extreme ideological echo chambers. Intercollegiate research highlights that algorithmic curation can shift partisan political hostility in a single week by an amount typically requiring three years of real-world exposure. A society suffering from hyper-polarization and institutional distrust loses the democratic consensus required to execute long-term sustainability policies. (Ekici, 2025)</w:t>
+        <w:t>As algorithms manipulate user feeds to maximize watch time, they push users toward extreme ideological echo chambers. Intercollegiate research highlights that algorithmic curation can shift partisan political hostility in a single week by an amount typically requiring three years of real-world exposure. A society suffering from hyper-polarization and institutional distrust loses the democratic consensus required to execute long-term sustainability policies. (Ekici, 2025)</w:t>
       </w:r>
     </w:p>
     <w:p>
@@ -9838,6 +9694,9 @@
         <w:ind w:firstLine="0"/>
       </w:pPr>
       <w:r>
+        <w:rPr>
+          <w:noProof/>
+        </w:rPr>
         <w:drawing>
           <wp:inline distT="0" distB="0" distL="0" distR="0" wp14:anchorId="3F70F25B" wp14:editId="3350494B">
             <wp:extent cx="5732145" cy="4379595"/>
@@ -9905,23 +9764,7 @@
           <w:sz w:val="20"/>
           <w:szCs w:val="18"/>
         </w:rPr>
-        <w:t>, Ghayth &amp; Bassma, Mohamad &amp; Haider, Aftab. (2026). Algorithmic Sustainability: Governance Conditions for AI-Driven Environmental Decision-Making. 10.20944/preprints</w:t>
-      </w:r>
-      <w:proofErr w:type="gramStart"/>
-      <w:r>
-        <w:rPr>
-          <w:sz w:val="20"/>
-          <w:szCs w:val="18"/>
-        </w:rPr>
-        <w:t>202602.0733.v</w:t>
-      </w:r>
-      <w:proofErr w:type="gramEnd"/>
-      <w:r>
-        <w:rPr>
-          <w:sz w:val="20"/>
-          <w:szCs w:val="18"/>
-        </w:rPr>
-        <w:t>2.</w:t>
+        <w:t>, Ghayth &amp; Bassma, Mohamad &amp; Haider, Aftab. (2026). Algorithmic Sustainability: Governance Conditions for AI-Driven Environmental Decision-Making. 10.20944/preprints202602.0733.v2.</w:t>
       </w:r>
     </w:p>
     <w:p>
@@ -10237,15 +10080,7 @@
         <w:ind w:firstLine="0"/>
       </w:pPr>
       <w:r>
-        <w:t xml:space="preserve">The weight of the stabilizer (S) </w:t>
-      </w:r>
-      <w:proofErr w:type="gramStart"/>
-      <w:r>
-        <w:t>pull</w:t>
-      </w:r>
-      <w:proofErr w:type="gramEnd"/>
-      <w:r>
-        <w:t xml:space="preserve"> in the per-step mix. Higher beta pulls both state and attention toward the attractor each step.</w:t>
+        <w:t>The weight of the stabilizer (S) pull in the per-step mix. Higher beta pulls both state and attention toward the attractor each step.</w:t>
       </w:r>
     </w:p>
     <w:p>
@@ -10337,15 +10172,7 @@
         <w:ind w:firstLine="0"/>
       </w:pPr>
       <w:r>
-        <w:t xml:space="preserve">The weighting </w:t>
-      </w:r>
-      <w:proofErr w:type="gramStart"/>
-      <w:r>
-        <w:t>curve</w:t>
-      </w:r>
-      <w:proofErr w:type="gramEnd"/>
-      <w:r>
-        <w:t xml:space="preserve"> over behavior variants. It shows where the current variant sits relative to the preferred operating center.</w:t>
+        <w:t>The weighting curve over behavior variants. It shows where the current variant sits relative to the preferred operating center.</w:t>
       </w:r>
     </w:p>
     <w:p>
@@ -10414,15 +10241,7 @@
         <w:ind w:firstLine="0"/>
       </w:pPr>
       <w:r>
-        <w:t xml:space="preserve">The </w:t>
-      </w:r>
-      <w:proofErr w:type="gramStart"/>
-      <w:r>
-        <w:t>amount</w:t>
-      </w:r>
-      <w:proofErr w:type="gramEnd"/>
-      <w:r>
-        <w:t xml:space="preserve"> of Qualia pull applied to the final behavior ratio. Higher influence means the vector field had more effect.</w:t>
+        <w:t>The amount of Qualia pull applied to the final behavior ratio. Higher influence means the vector field had more effect.</w:t>
       </w:r>
     </w:p>
     <w:p>
@@ -10445,15 +10264,7 @@
         <w:ind w:firstLine="0"/>
       </w:pPr>
       <w:r>
-        <w:t xml:space="preserve">A derived comparison score based on answer length and influence. It is not </w:t>
-      </w:r>
-      <w:proofErr w:type="gramStart"/>
-      <w:r>
-        <w:t>a true</w:t>
-      </w:r>
-      <w:proofErr w:type="gramEnd"/>
-      <w:r>
-        <w:t xml:space="preserve"> reasoning proof, but a useful local signal.</w:t>
+        <w:t>A derived comparison score based on answer length and influence. It is not a true reasoning proof, but a useful local signal.</w:t>
       </w:r>
     </w:p>
     <w:p>
@@ -10500,15 +10311,7 @@
       </w:pPr>
       <w:bookmarkStart w:id="27" w:name="_Toc242921192"/>
       <w:r>
-        <w:t xml:space="preserve">Inverse stability pressure. Lower anxiety is better in this lab because it means the response </w:t>
-      </w:r>
-      <w:proofErr w:type="gramStart"/>
-      <w:r>
-        <w:t>remained</w:t>
-      </w:r>
-      <w:proofErr w:type="gramEnd"/>
-      <w:r>
-        <w:t xml:space="preserve"> less volatile.</w:t>
+        <w:t>Inverse stability pressure. Lower anxiety is better in this lab because it means the response remained less volatile.</w:t>
       </w:r>
     </w:p>
     <w:p>
@@ -10645,24 +10448,14 @@
         </w:rPr>
         <w:t xml:space="preserve">: Example of the Pseudo Dynamic Lab as </w:t>
       </w:r>
-      <w:proofErr w:type="gramStart"/>
       <w:r>
         <w:rPr>
           <w:b/>
           <w:bCs/>
         </w:rPr>
-        <w:t>is</w:t>
-      </w:r>
-      <w:proofErr w:type="gramEnd"/>
-      <w:r>
-        <w:rPr>
-          <w:b/>
-          <w:bCs/>
-        </w:rPr>
-        <w:t xml:space="preserve"> improves and enhances </w:t>
-      </w:r>
-      <w:proofErr w:type="spellStart"/>
-      <w:proofErr w:type="gramStart"/>
+        <w:t xml:space="preserve">is improves and enhances </w:t>
+      </w:r>
+      <w:proofErr w:type="spellStart"/>
       <w:r>
         <w:rPr>
           <w:b/>
@@ -10671,7 +10464,6 @@
         <w:t>it’s</w:t>
       </w:r>
       <w:proofErr w:type="spellEnd"/>
-      <w:proofErr w:type="gramEnd"/>
       <w:r>
         <w:rPr>
           <w:b/>
@@ -11047,15 +10839,7 @@
         <w:t xml:space="preserve">world </w:t>
       </w:r>
       <w:r>
-        <w:t xml:space="preserve">has </w:t>
-      </w:r>
-      <w:proofErr w:type="gramStart"/>
-      <w:r>
-        <w:t>skipped —</w:t>
-      </w:r>
-      <w:proofErr w:type="gramEnd"/>
-      <w:r>
-        <w:t xml:space="preserve"> accountable, domain-structured, locally owned intelligence aimed at sustaining society in the face of another </w:t>
+        <w:t xml:space="preserve">has skipped — accountable, domain-structured, locally owned intelligence aimed at sustaining society in the face of another </w:t>
       </w:r>
       <w:r>
         <w:t>exogenous</w:t>
@@ -11067,15 +10851,7 @@
         <w:t>one</w:t>
       </w:r>
       <w:r>
-        <w:t xml:space="preserve"> even understands, but </w:t>
-      </w:r>
-      <w:proofErr w:type="gramStart"/>
-      <w:r>
-        <w:t>fear</w:t>
-      </w:r>
-      <w:proofErr w:type="gramEnd"/>
-      <w:r>
-        <w:t xml:space="preserve">. Within the </w:t>
+        <w:t xml:space="preserve"> even understands, but fear. Within the </w:t>
       </w:r>
       <w:r>
         <w:t>Pseudo dynamics</w:t>
@@ -11096,15 +10872,7 @@
         <w:t xml:space="preserve"> measure, project, change </w:t>
       </w:r>
       <w:r>
-        <w:t xml:space="preserve">what AI thinks or do. The mast was audited and verified numerous Big Tech </w:t>
-      </w:r>
-      <w:proofErr w:type="gramStart"/>
-      <w:r>
-        <w:t>AI’s</w:t>
-      </w:r>
-      <w:proofErr w:type="gramEnd"/>
-      <w:r>
-        <w:t xml:space="preserve"> </w:t>
+        <w:t xml:space="preserve">what AI thinks or do. The mast was audited and verified numerous Big Tech AI’s </w:t>
       </w:r>
       <w:r>
         <w:t>were</w:t>
@@ -11174,13 +10942,8 @@
       <w:r>
         <w:t xml:space="preserve">blue collar workers, </w:t>
       </w:r>
-      <w:proofErr w:type="gramStart"/>
-      <w:r>
-        <w:t>more and more</w:t>
-      </w:r>
-      <w:proofErr w:type="gramEnd"/>
-      <w:r>
-        <w:t xml:space="preserve"> work pattens are recognized every hour.</w:t>
+      <w:r>
+        <w:t>more and more work pattens are recognized every hour.</w:t>
       </w:r>
       <w:r>
         <w:t xml:space="preserve"> When the tool makes a person three times more capable, the person who owns the tool keeps the leverage. That is the single most important thing this architecture offers him — the means of intellectual production, without a landlord.</w:t>
@@ -11296,15 +11059,7 @@
         <w:t>Privacy as dignity</w:t>
       </w:r>
       <w:r>
-        <w:t xml:space="preserve">. His questions about his health, his debts, his boss never </w:t>
-      </w:r>
-      <w:proofErr w:type="gramStart"/>
-      <w:r>
-        <w:t>leave</w:t>
-      </w:r>
-      <w:proofErr w:type="gramEnd"/>
-      <w:r>
-        <w:t xml:space="preserve"> his machine. Tenancy monetizes his uncertainty; ownership protects it.</w:t>
+        <w:t>. His questions about his health, his debts, his boss never leave his machine. Tenancy monetizes his uncertainty; ownership protects it.</w:t>
       </w:r>
       <w:r>
         <w:t xml:space="preserve"> </w:t>
@@ -11369,13 +11124,8 @@
         <w:t xml:space="preserve">. Every person who chooses </w:t>
       </w:r>
       <w:r>
-        <w:t xml:space="preserve">to use our </w:t>
-      </w:r>
-      <w:proofErr w:type="gramStart"/>
-      <w:r>
-        <w:t>persona</w:t>
-      </w:r>
-      <w:proofErr w:type="gramEnd"/>
+        <w:t>to use our persona</w:t>
+      </w:r>
       <w:r>
         <w:t>, local intelligence over rented, opaque intelligence is casting the only vote that shapes how this era unfolds — what gets built next.</w:t>
       </w:r>
@@ -11544,15 +11294,7 @@
         <w:t>Many organizations continue to employ policies developed for stable and predictable environments. However, existing sustainability initiatives have not resolved major social and global challenges. Issues such as</w:t>
       </w:r>
       <w:r>
-        <w:t xml:space="preserve"> </w:t>
-      </w:r>
-      <w:proofErr w:type="gramStart"/>
-      <w:r>
-        <w:t>a sustainable</w:t>
-      </w:r>
-      <w:proofErr w:type="gramEnd"/>
-      <w:r>
-        <w:t xml:space="preserve"> society, </w:t>
+        <w:t xml:space="preserve"> a sustainable society, </w:t>
       </w:r>
       <w:r>
         <w:t>disengagement, inequality, hunger, climate change, and species extinction are worsening.</w:t>
@@ -11586,15 +11328,7 @@
         <w:t>depend</w:t>
       </w:r>
       <w:r>
-        <w:t xml:space="preserve"> on both natural sciences and </w:t>
-      </w:r>
-      <w:proofErr w:type="gramStart"/>
-      <w:r>
-        <w:t>social</w:t>
-      </w:r>
-      <w:proofErr w:type="gramEnd"/>
-      <w:r>
-        <w:t xml:space="preserve">. </w:t>
+        <w:t xml:space="preserve"> on both natural sciences and social. </w:t>
       </w:r>
       <w:r>
         <w:t>A</w:t>
@@ -11738,15 +11472,7 @@
         <w:t xml:space="preserve">While Aristotle’s work dealt with the theoretical notion of first principles, the method was notably applied in practice by his contemporary Euclid, whose ground-breaking mathematical treatise ‘Elements’ used an indispensable set of first principles to establish what today are considered fundamental geometrical proofs. </w:t>
       </w:r>
       <w:r>
-        <w:t xml:space="preserve">The same approach allowed </w:t>
-      </w:r>
-      <w:proofErr w:type="gramStart"/>
-      <w:r>
-        <w:t>us</w:t>
-      </w:r>
-      <w:proofErr w:type="gramEnd"/>
-      <w:r>
-        <w:t xml:space="preserve"> a groundbreaking equation applied within the Pseudo dynamics Lab within the, without the breakthrough we achieved by solving this equation it would not have been possible.</w:t>
+        <w:t>The same approach allowed us a groundbreaking equation applied within the Pseudo dynamics Lab within the, without the breakthrough we achieved by solving this equation it would not have been possible.</w:t>
       </w:r>
     </w:p>
     <w:p>
@@ -11974,23 +11700,7 @@
         <w:ind w:firstLine="0"/>
       </w:pPr>
       <w:r>
-        <w:t xml:space="preserve">We get through life by reasoning by analogy, which means copying what other people do with slight variations. And you </w:t>
-      </w:r>
-      <w:proofErr w:type="gramStart"/>
-      <w:r>
-        <w:t>have to</w:t>
-      </w:r>
-      <w:proofErr w:type="gramEnd"/>
-      <w:r>
-        <w:t xml:space="preserve"> do that. Otherwise, mentally, you wouldn’t be able to get through the day. But when you want to do something new, you </w:t>
-      </w:r>
-      <w:proofErr w:type="gramStart"/>
-      <w:r>
-        <w:t>have to</w:t>
-      </w:r>
-      <w:proofErr w:type="gramEnd"/>
-      <w:r>
-        <w:t xml:space="preserve"> apply the [first principles] approach”. “In layman’s terms, first </w:t>
+        <w:t xml:space="preserve">We get through life by reasoning by analogy, which means copying what other people do with slight variations. And you have to do that. Otherwise, mentally, you wouldn’t be able to get through the day. But when you want to do something new, you have to apply the [first principles] approach”. “In layman’s terms, first </w:t>
       </w:r>
       <w:r>
         <w:lastRenderedPageBreak/>
@@ -13057,27 +12767,7 @@
                 <w:szCs w:val="20"/>
                 <w:lang w:val="en-ZA" w:eastAsia="en-ZA"/>
               </w:rPr>
-              <w:t xml:space="preserve">Synthetic content </w:t>
-            </w:r>
-            <w:r>
-              <w:rPr>
-                <w:rFonts w:eastAsia="Times New Roman" w:cs="Times New Roman"/>
-                <w:color w:val="000000"/>
-                <w:sz w:val="20"/>
-                <w:szCs w:val="20"/>
-                <w:lang w:val="en-ZA" w:eastAsia="en-ZA"/>
-              </w:rPr>
-              <w:t>labelling</w:t>
-            </w:r>
-            <w:r>
-              <w:rPr>
-                <w:rFonts w:eastAsia="Times New Roman" w:cs="Times New Roman"/>
-                <w:color w:val="000000"/>
-                <w:sz w:val="20"/>
-                <w:szCs w:val="20"/>
-                <w:lang w:val="en-ZA" w:eastAsia="en-ZA"/>
-              </w:rPr>
-              <w:t>, state oversight, algorithmic control</w:t>
+              <w:t>Synthetic content labelling, state oversight, algorithmic control</w:t>
             </w:r>
           </w:p>
         </w:tc>
@@ -13702,15 +13392,7 @@
         <w:t>we implemented one Vector Database</w:t>
       </w:r>
       <w:r>
-        <w:t xml:space="preserve"> (a database built for AI memory) and </w:t>
-      </w:r>
-      <w:proofErr w:type="gramStart"/>
-      <w:r>
-        <w:t>organize</w:t>
-      </w:r>
-      <w:proofErr w:type="gramEnd"/>
-      <w:r>
-        <w:t xml:space="preserve"> it smartly:</w:t>
+        <w:t xml:space="preserve"> (a database built for AI memory) and organize it smartly:</w:t>
       </w:r>
     </w:p>
     <w:p>
@@ -13820,15 +13502,7 @@
         <w:ind w:firstLine="0"/>
       </w:pPr>
       <w:r>
-        <w:t xml:space="preserve">"The </w:t>
-      </w:r>
-      <w:proofErr w:type="gramStart"/>
-      <w:r>
-        <w:t>Coordinator</w:t>
-      </w:r>
-      <w:proofErr w:type="gramEnd"/>
-      <w:r>
-        <w:t>: Your code routes the question to both the Biology and Physics data tags.</w:t>
+        <w:t>"The Coordinator: Your code routes the question to both the Biology and Physics data tags.</w:t>
       </w:r>
     </w:p>
     <w:p>
@@ -14004,15 +13678,7 @@
         <w:ind w:firstLine="0"/>
       </w:pPr>
       <w:r>
-        <w:t xml:space="preserve">Think of this like an automatic recycling plant. The raw data streams </w:t>
-      </w:r>
-      <w:proofErr w:type="gramStart"/>
-      <w:r>
-        <w:t>in,</w:t>
-      </w:r>
-      <w:proofErr w:type="gramEnd"/>
-      <w:r>
-        <w:t xml:space="preserve"> automated sorters (Gateway Worker tag and label it, and a central brain watches how the pieces interact to find new discoveries.</w:t>
+        <w:t>Think of this like an automatic recycling plant. The raw data streams in, automated sorters (Gateway Worker tag and label it, and a central brain watches how the pieces interact to find new discoveries.</w:t>
       </w:r>
     </w:p>
     <w:p>
@@ -14196,15 +13862,7 @@
         <w:t xml:space="preserve">To make pattern discovery self-driving, </w:t>
       </w:r>
       <w:r>
-        <w:t xml:space="preserve">we implemented the concept of </w:t>
-      </w:r>
-      <w:proofErr w:type="gramStart"/>
-      <w:r>
-        <w:t>a Vector</w:t>
-      </w:r>
-      <w:proofErr w:type="gramEnd"/>
-      <w:r>
-        <w:t xml:space="preserve"> Space</w:t>
+        <w:t>we implemented the concept of a Vector Space</w:t>
       </w:r>
       <w:r>
         <w:t xml:space="preserve"> (an abstract map where similar ideas sit close together).</w:t>
@@ -14249,15 +13907,7 @@
         <w:ind w:firstLine="0"/>
       </w:pPr>
       <w:r>
-        <w:t xml:space="preserve">The In-Between State: A new piece of data arrives that combines biochemistry and quantum physics. In the vector database, this data lands exactly in the middle of the </w:t>
-      </w:r>
-      <w:proofErr w:type="gramStart"/>
-      <w:r>
-        <w:t>Biology</w:t>
-      </w:r>
-      <w:proofErr w:type="gramEnd"/>
-      <w:r>
-        <w:t xml:space="preserve"> cluster and the Physics cluster. It exists in a "superposition" because it belongs to both.</w:t>
+        <w:t>The In-Between State: A new piece of data arrives that combines biochemistry and quantum physics. In the vector database, this data lands exactly in the middle of the Biology cluster and the Physics cluster. It exists in a "superposition" because it belongs to both.</w:t>
       </w:r>
     </w:p>
     <w:p>
@@ -14332,15 +13982,7 @@
         <w:t>Sentinari</w:t>
       </w:r>
       <w:r>
-        <w:t xml:space="preserve">, </w:t>
-      </w:r>
-      <w:proofErr w:type="gramStart"/>
-      <w:r>
-        <w:t>It</w:t>
-      </w:r>
-      <w:proofErr w:type="gramEnd"/>
-      <w:r>
-        <w:t xml:space="preserve"> asks: "What is the hidden connection between these items? Give this new intersection a name."</w:t>
+        <w:t>, It asks: "What is the hidden connection between these items? Give this new intersection a name."</w:t>
       </w:r>
     </w:p>
     <w:p>
@@ -14492,15 +14134,7 @@
       </w:r>
       <w:proofErr w:type="spellEnd"/>
       <w:r>
-        <w:t xml:space="preserve"> or Milvus, which </w:t>
-      </w:r>
-      <w:proofErr w:type="gramStart"/>
-      <w:r>
-        <w:t>excel</w:t>
-      </w:r>
-      <w:proofErr w:type="gramEnd"/>
-      <w:r>
-        <w:t xml:space="preserve"> at high-speed streaming data and filtering by tags.</w:t>
+        <w:t xml:space="preserve"> or Milvus, which excel at high-speed streaming data and filtering by tags.</w:t>
       </w:r>
     </w:p>
     <w:p>
@@ -14550,23 +14184,7 @@
         <w:t>Sentinari</w:t>
       </w:r>
       <w:r>
-        <w:t xml:space="preserve"> is powerful, but it requires a lot of computing power. If you pass every single piece of streaming data through it just to </w:t>
-      </w:r>
-      <w:proofErr w:type="gramStart"/>
-      <w:r>
-        <w:t>say</w:t>
-      </w:r>
-      <w:proofErr w:type="gramEnd"/>
-      <w:r>
-        <w:t xml:space="preserve"> "this is biology," we would waste a lot of money and create a traffic jam. </w:t>
-      </w:r>
-      <w:proofErr w:type="gramStart"/>
-      <w:r>
-        <w:t>A Gateway</w:t>
-      </w:r>
-      <w:proofErr w:type="gramEnd"/>
-      <w:r>
-        <w:t xml:space="preserve"> LLM can be a tiny, lightning-fast model </w:t>
+        <w:t xml:space="preserve"> is powerful, but it requires a lot of computing power. If you pass every single piece of streaming data through it just to say "this is biology," we would waste a lot of money and create a traffic jam. A Gateway LLM can be a tiny, lightning-fast model </w:t>
       </w:r>
       <w:r>
         <w:lastRenderedPageBreak/>
@@ -14591,15 +14209,7 @@
         <w:t>Separation of Duties:</w:t>
       </w:r>
       <w:r>
-        <w:t xml:space="preserve"> The Gateway only cares about </w:t>
-      </w:r>
-      <w:proofErr w:type="gramStart"/>
-      <w:r>
-        <w:t>routing</w:t>
-      </w:r>
-      <w:proofErr w:type="gramEnd"/>
-      <w:r>
-        <w:t xml:space="preserve"> and cleaning. </w:t>
+        <w:t xml:space="preserve"> The Gateway only cares about routing and cleaning. </w:t>
       </w:r>
       <w:r>
         <w:t>The Guardian only cares</w:t>
@@ -14698,15 +14308,7 @@
         <w:t>Traffic Routing</w:t>
       </w:r>
       <w:r>
-        <w:t xml:space="preserve">: Instead of waking up the whole system, </w:t>
-      </w:r>
-      <w:proofErr w:type="gramStart"/>
-      <w:r>
-        <w:t>the Gateway</w:t>
-      </w:r>
-      <w:proofErr w:type="gramEnd"/>
-      <w:r>
-        <w:t xml:space="preserve"> sends the data to the specific corner of your database where it belongs.</w:t>
+        <w:t>: Instead of waking up the whole system, the Gateway sends the data to the specific corner of your database where it belongs.</w:t>
       </w:r>
     </w:p>
     <w:p>
@@ -15247,15 +14849,7 @@
         <w:ind w:firstLine="0"/>
       </w:pPr>
       <w:r>
-        <w:t xml:space="preserve">Every query </w:t>
-      </w:r>
-      <w:proofErr w:type="gramStart"/>
-      <w:r>
-        <w:t>passes</w:t>
-      </w:r>
-      <w:proofErr w:type="gramEnd"/>
-      <w:r>
-        <w:t xml:space="preserve"> through the Gateway.</w:t>
+        <w:t>Every query passes through the Gateway.</w:t>
       </w:r>
     </w:p>
     <w:p>
@@ -16106,21 +15700,8 @@
       <w:pPr>
         <w:ind w:firstLine="0"/>
       </w:pPr>
-      <w:proofErr w:type="gramStart"/>
-      <w:r>
-        <w:t>Runs</w:t>
-      </w:r>
-      <w:proofErr w:type="gramEnd"/>
-      <w:r>
-        <w:t xml:space="preserve"> tests to confirm routing </w:t>
-      </w:r>
-      <w:proofErr w:type="gramStart"/>
-      <w:r>
-        <w:t>works</w:t>
-      </w:r>
-      <w:proofErr w:type="gramEnd"/>
-      <w:r>
-        <w:t>.</w:t>
+      <w:r>
+        <w:t>Runs tests to confirm routing works.</w:t>
       </w:r>
     </w:p>
     <w:p>
@@ -16251,11 +15832,7 @@
       </w:r>
       <w:proofErr w:type="spellEnd"/>
       <w:r>
-        <w:t xml:space="preserve"> specs </w:t>
-      </w:r>
-      <w:proofErr w:type="gramStart"/>
-      <w:r>
-        <w:t>and auto</w:t>
+        <w:t xml:space="preserve"> specs and auto</w:t>
       </w:r>
       <w:r>
         <w:rPr>
@@ -16264,11 +15841,7 @@
         <w:t>‑</w:t>
       </w:r>
       <w:r>
-        <w:t>generate</w:t>
-      </w:r>
-      <w:proofErr w:type="gramEnd"/>
-      <w:r>
-        <w:t xml:space="preserve"> adapters.</w:t>
+        <w:t>generate adapters.</w:t>
       </w:r>
     </w:p>
     <w:p>
@@ -16563,30 +16136,14 @@
                 <w:szCs w:val="20"/>
               </w:rPr>
               <w:lastRenderedPageBreak/>
-              <w:t xml:space="preserve">improves intelligent decision-support </w:t>
-            </w:r>
-            <w:proofErr w:type="gramStart"/>
+              <w:t>improves intelligent decision-support systems.</w:t>
+            </w:r>
             <w:r>
               <w:rPr>
                 <w:sz w:val="22"/>
                 <w:szCs w:val="20"/>
               </w:rPr>
-              <w:t>systems.</w:t>
-            </w:r>
-            <w:r>
-              <w:rPr>
-                <w:sz w:val="22"/>
-                <w:szCs w:val="20"/>
-              </w:rPr>
-              <w:t>.</w:t>
-            </w:r>
-            <w:proofErr w:type="gramEnd"/>
-            <w:r>
-              <w:rPr>
-                <w:sz w:val="22"/>
-                <w:szCs w:val="20"/>
-              </w:rPr>
-              <w:t xml:space="preserve"> (</w:t>
+              <w:t>. (</w:t>
             </w:r>
             <w:proofErr w:type="spellStart"/>
             <w:r>
@@ -16863,25 +16420,7 @@
                 <w:color w:val="000000"/>
                 <w:sz w:val="22"/>
               </w:rPr>
-              <w:t xml:space="preserve"> Training </w:t>
-            </w:r>
-            <w:proofErr w:type="gramStart"/>
-            <w:r>
-              <w:rPr>
-                <w:rFonts w:ascii="Aptos Narrow" w:hAnsi="Aptos Narrow"/>
-                <w:color w:val="000000"/>
-                <w:sz w:val="22"/>
-              </w:rPr>
-              <w:t>an AI</w:t>
-            </w:r>
-            <w:proofErr w:type="gramEnd"/>
-            <w:r>
-              <w:rPr>
-                <w:rFonts w:ascii="Aptos Narrow" w:hAnsi="Aptos Narrow"/>
-                <w:color w:val="000000"/>
-                <w:sz w:val="22"/>
-              </w:rPr>
-              <w:t xml:space="preserve"> on unlabeled data so it can discover hidden patterns or groupings on its own.</w:t>
+              <w:t xml:space="preserve"> Training an AI on unlabeled data so it can discover hidden patterns or groupings on its own.</w:t>
             </w:r>
           </w:p>
         </w:tc>
@@ -16919,25 +16458,7 @@
                 <w:color w:val="000000"/>
                 <w:sz w:val="22"/>
               </w:rPr>
-              <w:t xml:space="preserve"> Training </w:t>
-            </w:r>
-            <w:proofErr w:type="gramStart"/>
-            <w:r>
-              <w:rPr>
-                <w:rFonts w:ascii="Aptos Narrow" w:hAnsi="Aptos Narrow"/>
-                <w:color w:val="000000"/>
-                <w:sz w:val="22"/>
-              </w:rPr>
-              <w:t>an AI</w:t>
-            </w:r>
-            <w:proofErr w:type="gramEnd"/>
-            <w:r>
-              <w:rPr>
-                <w:rFonts w:ascii="Aptos Narrow" w:hAnsi="Aptos Narrow"/>
-                <w:color w:val="000000"/>
-                <w:sz w:val="22"/>
-              </w:rPr>
-              <w:t xml:space="preserve"> through a system of rewards and penalties (trial and error) to achieve a goal.</w:t>
+              <w:t xml:space="preserve"> Training an AI through a system of rewards and penalties (trial and error) to achieve a goal.</w:t>
             </w:r>
           </w:p>
         </w:tc>
@@ -16983,25 +16504,7 @@
                 <w:color w:val="000000"/>
                 <w:sz w:val="22"/>
               </w:rPr>
-              <w:t xml:space="preserve"> (Supplemental Information </w:t>
-            </w:r>
-            <w:proofErr w:type="gramStart"/>
-            <w:r>
-              <w:rPr>
-                <w:rFonts w:ascii="Aptos Narrow" w:hAnsi="Aptos Narrow"/>
-                <w:color w:val="000000"/>
-                <w:sz w:val="22"/>
-              </w:rPr>
-              <w:t>9:,</w:t>
-            </w:r>
-            <w:proofErr w:type="gramEnd"/>
-            <w:r>
-              <w:rPr>
-                <w:rFonts w:ascii="Aptos Narrow" w:hAnsi="Aptos Narrow"/>
-                <w:color w:val="000000"/>
-                <w:sz w:val="22"/>
-              </w:rPr>
-              <w:t xml:space="preserve"> n.d.)</w:t>
+              <w:t xml:space="preserve"> (Supplemental Information 9:, n.d.)</w:t>
             </w:r>
           </w:p>
         </w:tc>
@@ -17101,25 +16604,7 @@
                 <w:color w:val="000000"/>
                 <w:sz w:val="22"/>
               </w:rPr>
-              <w:t xml:space="preserve"> A massive neural network </w:t>
-            </w:r>
-            <w:proofErr w:type="gramStart"/>
-            <w:r>
-              <w:rPr>
-                <w:rFonts w:ascii="Aptos Narrow" w:hAnsi="Aptos Narrow"/>
-                <w:color w:val="000000"/>
-                <w:sz w:val="22"/>
-              </w:rPr>
-              <w:t>trained on</w:t>
-            </w:r>
-            <w:proofErr w:type="gramEnd"/>
-            <w:r>
-              <w:rPr>
-                <w:rFonts w:ascii="Aptos Narrow" w:hAnsi="Aptos Narrow"/>
-                <w:color w:val="000000"/>
-                <w:sz w:val="22"/>
-              </w:rPr>
-              <w:t xml:space="preserve"> vast amounts of text data to understand, summarize, and generate human-like language.</w:t>
+              <w:t xml:space="preserve"> A massive neural network trained on vast amounts of text data to understand, summarize, and generate human-like language.</w:t>
             </w:r>
             <w:r>
               <w:rPr>
@@ -17165,25 +16650,7 @@
                 <w:color w:val="000000"/>
                 <w:sz w:val="22"/>
               </w:rPr>
-              <w:t xml:space="preserve"> </w:t>
-            </w:r>
-            <w:proofErr w:type="gramStart"/>
-            <w:r>
-              <w:rPr>
-                <w:rFonts w:ascii="Aptos Narrow" w:hAnsi="Aptos Narrow"/>
-                <w:color w:val="000000"/>
-                <w:sz w:val="22"/>
-              </w:rPr>
-              <w:t>A neural</w:t>
-            </w:r>
-            <w:proofErr w:type="gramEnd"/>
-            <w:r>
-              <w:rPr>
-                <w:rFonts w:ascii="Aptos Narrow" w:hAnsi="Aptos Narrow"/>
-                <w:color w:val="000000"/>
-                <w:sz w:val="22"/>
-              </w:rPr>
-              <w:t xml:space="preserve"> network architecture introduced in 2017 that allows models to process words in a sentence simultaneously by weighing the context of each word (the foundation of modern LLMs).</w:t>
+              <w:t xml:space="preserve"> A neural network architecture introduced in 2017 that allows models to process words in a sentence simultaneously by weighing the context of each word (the foundation of modern LLMs).</w:t>
             </w:r>
             <w:r>
               <w:rPr>
@@ -17406,25 +16873,7 @@
                 <w:color w:val="000000"/>
                 <w:sz w:val="22"/>
               </w:rPr>
-              <w:t xml:space="preserve"> A technique that connects an LLM to external databases or live documents so it can look up </w:t>
-            </w:r>
-            <w:proofErr w:type="gramStart"/>
-            <w:r>
-              <w:rPr>
-                <w:rFonts w:ascii="Aptos Narrow" w:hAnsi="Aptos Narrow"/>
-                <w:color w:val="000000"/>
-                <w:sz w:val="22"/>
-              </w:rPr>
-              <w:t>factual information</w:t>
-            </w:r>
-            <w:proofErr w:type="gramEnd"/>
-            <w:r>
-              <w:rPr>
-                <w:rFonts w:ascii="Aptos Narrow" w:hAnsi="Aptos Narrow"/>
-                <w:color w:val="000000"/>
-                <w:sz w:val="22"/>
-              </w:rPr>
-              <w:t xml:space="preserve"> before generating an answer. </w:t>
+              <w:t xml:space="preserve"> A technique that connects an LLM to external databases or live documents so it can look up factual information before generating an answer. </w:t>
             </w:r>
             <w:r>
               <w:rPr>
@@ -17692,43 +17141,7 @@
                 <w:color w:val="000000"/>
                 <w:sz w:val="22"/>
               </w:rPr>
-              <w:t xml:space="preserve"> Assumptions made by a model that </w:t>
-            </w:r>
-            <w:proofErr w:type="gramStart"/>
-            <w:r>
-              <w:rPr>
-                <w:rFonts w:ascii="Aptos Narrow" w:hAnsi="Aptos Narrow"/>
-                <w:color w:val="000000"/>
-                <w:sz w:val="22"/>
-              </w:rPr>
-              <w:t>simplify</w:t>
-            </w:r>
-            <w:proofErr w:type="gramEnd"/>
-            <w:r>
-              <w:rPr>
-                <w:rFonts w:ascii="Aptos Narrow" w:hAnsi="Aptos Narrow"/>
-                <w:color w:val="000000"/>
-                <w:sz w:val="22"/>
-              </w:rPr>
-              <w:t xml:space="preserve"> the process of learning to do its assigned task. Most supervised machine learning models perform better with </w:t>
-            </w:r>
-            <w:proofErr w:type="gramStart"/>
-            <w:r>
-              <w:rPr>
-                <w:rFonts w:ascii="Aptos Narrow" w:hAnsi="Aptos Narrow"/>
-                <w:color w:val="000000"/>
-                <w:sz w:val="22"/>
-              </w:rPr>
-              <w:t>low ,</w:t>
-            </w:r>
-            <w:proofErr w:type="gramEnd"/>
-            <w:r>
-              <w:rPr>
-                <w:rFonts w:ascii="Aptos Narrow" w:hAnsi="Aptos Narrow"/>
-                <w:color w:val="000000"/>
-                <w:sz w:val="22"/>
-              </w:rPr>
-              <w:t xml:space="preserve"> as these assumptions can negatively affect results.</w:t>
+              <w:t xml:space="preserve"> Assumptions made by a model that simplify the process of learning to do its assigned task. Most supervised machine learning models perform better with low , as these assumptions can negatively affect results.</w:t>
             </w:r>
             <w:r>
               <w:rPr>
@@ -18077,25 +17490,7 @@
                 <w:color w:val="000000"/>
                 <w:sz w:val="22"/>
               </w:rPr>
-              <w:t xml:space="preserve"> The process of analyzing datasets </w:t>
-            </w:r>
-            <w:proofErr w:type="gramStart"/>
-            <w:r>
-              <w:rPr>
-                <w:rFonts w:ascii="Aptos Narrow" w:hAnsi="Aptos Narrow"/>
-                <w:color w:val="000000"/>
-                <w:sz w:val="22"/>
-              </w:rPr>
-              <w:t>in order to</w:t>
-            </w:r>
-            <w:proofErr w:type="gramEnd"/>
-            <w:r>
-              <w:rPr>
-                <w:rFonts w:ascii="Aptos Narrow" w:hAnsi="Aptos Narrow"/>
-                <w:color w:val="000000"/>
-                <w:sz w:val="22"/>
-              </w:rPr>
-              <w:t xml:space="preserve"> discover new patterns that might improve the model.</w:t>
+              <w:t xml:space="preserve"> The process of analyzing datasets in order to discover new patterns that might improve the model.</w:t>
             </w:r>
             <w:r>
               <w:rPr>
@@ -18703,15 +18098,7 @@
       </w:r>
       <w:proofErr w:type="spellEnd"/>
       <w:r>
-        <w:t xml:space="preserve">, B., &amp; Lefebvre, L. (2010). Why do users communicate via such or such </w:t>
-      </w:r>
-      <w:proofErr w:type="gramStart"/>
-      <w:r>
-        <w:t>media?.</w:t>
-      </w:r>
-      <w:proofErr w:type="gramEnd"/>
-      <w:r>
-        <w:t xml:space="preserve"> Proceedings of the 6th Nordic Conference on Human-Computer Interaction: Extending Boundaries. https://doi.org/10.1145/1868914.1868990</w:t>
+        <w:t>, B., &amp; Lefebvre, L. (2010). Why do users communicate via such or such media?. Proceedings of the 6th Nordic Conference on Human-Computer Interaction: Extending Boundaries. https://doi.org/10.1145/1868914.1868990</w:t>
       </w:r>
     </w:p>
     <w:p>
@@ -18778,15 +18165,7 @@
       </w:r>
       <w:proofErr w:type="spellEnd"/>
       <w:r>
-        <w:t xml:space="preserve"> (n.d.). Table 3: Table of hyperparameters values used in each </w:t>
-      </w:r>
-      <w:proofErr w:type="gramStart"/>
-      <w:r>
-        <w:t>model..</w:t>
-      </w:r>
-      <w:proofErr w:type="gramEnd"/>
-      <w:r>
-        <w:t xml:space="preserve"> </w:t>
+        <w:t xml:space="preserve"> (n.d.). Table 3: Table of hyperparameters values used in each model.. </w:t>
       </w:r>
       <w:proofErr w:type="spellStart"/>
       <w:r>
@@ -18807,15 +18186,7 @@
       </w:r>
       <w:proofErr w:type="spellEnd"/>
       <w:r>
-        <w:t xml:space="preserve"> (n.d.). Table 1: Default values for some hyperparameters used in the </w:t>
-      </w:r>
-      <w:proofErr w:type="gramStart"/>
-      <w:r>
-        <w:t>experiments..</w:t>
-      </w:r>
-      <w:proofErr w:type="gramEnd"/>
-      <w:r>
-        <w:t xml:space="preserve"> </w:t>
+        <w:t xml:space="preserve"> (n.d.). Table 1: Default values for some hyperparameters used in the experiments.. </w:t>
       </w:r>
       <w:proofErr w:type="spellStart"/>
       <w:r>
@@ -18836,15 +18207,7 @@
       </w:r>
       <w:proofErr w:type="spellEnd"/>
       <w:r>
-        <w:t xml:space="preserve"> (n.d.). Supplemental Information 11: Hyperparameters for each model used. Values marked with * indicate the final hyperparameter configuration used for reporting </w:t>
-      </w:r>
-      <w:proofErr w:type="gramStart"/>
-      <w:r>
-        <w:t>results..</w:t>
-      </w:r>
-      <w:proofErr w:type="gramEnd"/>
-      <w:r>
-        <w:t xml:space="preserve"> </w:t>
+        <w:t xml:space="preserve"> (n.d.). Supplemental Information 11: Hyperparameters for each model used. Values marked with * indicate the final hyperparameter configuration used for reporting results.. </w:t>
       </w:r>
       <w:proofErr w:type="spellStart"/>
       <w:r>
@@ -18865,15 +18228,7 @@
       </w:r>
       <w:proofErr w:type="spellEnd"/>
       <w:r>
-        <w:t xml:space="preserve"> (n.d.). Table 2: Hyperparameters used in proposed </w:t>
-      </w:r>
-      <w:proofErr w:type="gramStart"/>
-      <w:r>
-        <w:t>model..</w:t>
-      </w:r>
-      <w:proofErr w:type="gramEnd"/>
-      <w:r>
-        <w:t xml:space="preserve"> </w:t>
+        <w:t xml:space="preserve"> (n.d.). Table 2: Hyperparameters used in proposed model.. </w:t>
       </w:r>
       <w:proofErr w:type="spellStart"/>
       <w:r>
@@ -18894,15 +18249,7 @@
       </w:r>
       <w:proofErr w:type="spellEnd"/>
       <w:r>
-        <w:t xml:space="preserve"> (n.d.). Table 1: Hyperparameters used in the proposed </w:t>
-      </w:r>
-      <w:proofErr w:type="gramStart"/>
-      <w:r>
-        <w:t>model..</w:t>
-      </w:r>
-      <w:proofErr w:type="gramEnd"/>
-      <w:r>
-        <w:t xml:space="preserve"> </w:t>
+        <w:t xml:space="preserve"> (n.d.). Table 1: Hyperparameters used in the proposed model.. </w:t>
       </w:r>
       <w:proofErr w:type="spellStart"/>
       <w:r>
@@ -18924,23 +18271,7 @@
       </w:r>
       <w:proofErr w:type="spellEnd"/>
       <w:r>
-        <w:t xml:space="preserve"> Sciences </w:t>
-      </w:r>
-      <w:proofErr w:type="gramStart"/>
-      <w:r>
-        <w:t>Publications,</w:t>
-      </w:r>
-      <w:proofErr w:type="gramEnd"/>
-      <w:r>
-        <w:t xml:space="preserve"> Ltd (n.d.). Figure 1—source data 1. Parameter values used in the fitness </w:t>
-      </w:r>
-      <w:proofErr w:type="gramStart"/>
-      <w:r>
-        <w:t>model..</w:t>
-      </w:r>
-      <w:proofErr w:type="gramEnd"/>
-      <w:r>
-        <w:t xml:space="preserve"> </w:t>
+        <w:t xml:space="preserve"> Sciences Publications, Ltd (n.d.). Figure 1—source data 1. Parameter values used in the fitness model.. </w:t>
       </w:r>
       <w:proofErr w:type="spellStart"/>
       <w:r>
@@ -18961,23 +18292,7 @@
       </w:r>
       <w:proofErr w:type="spellEnd"/>
       <w:r>
-        <w:t xml:space="preserve"> Sciences </w:t>
-      </w:r>
-      <w:proofErr w:type="gramStart"/>
-      <w:r>
-        <w:t>Publications,</w:t>
-      </w:r>
-      <w:proofErr w:type="gramEnd"/>
-      <w:r>
-        <w:t xml:space="preserve"> Ltd (n.d.). Figure 2—source data 1. Parameter values used in the diffusion model </w:t>
-      </w:r>
-      <w:proofErr w:type="gramStart"/>
-      <w:r>
-        <w:t>simulations..</w:t>
-      </w:r>
-      <w:proofErr w:type="gramEnd"/>
-      <w:r>
-        <w:t xml:space="preserve"> </w:t>
+        <w:t xml:space="preserve"> Sciences Publications, Ltd (n.d.). Figure 2—source data 1. Parameter values used in the diffusion model simulations.. </w:t>
       </w:r>
       <w:proofErr w:type="spellStart"/>
       <w:r>
@@ -18998,15 +18313,7 @@
       </w:r>
       <w:proofErr w:type="spellEnd"/>
       <w:r>
-        <w:t xml:space="preserve"> (n.d.). Table 5: Fine-tuned hyperparameters values for Urdu-NERD </w:t>
-      </w:r>
-      <w:proofErr w:type="gramStart"/>
-      <w:r>
-        <w:t>model..</w:t>
-      </w:r>
-      <w:proofErr w:type="gramEnd"/>
-      <w:r>
-        <w:t xml:space="preserve"> </w:t>
+        <w:t xml:space="preserve"> (n.d.). Table 5: Fine-tuned hyperparameters values for Urdu-NERD model.. </w:t>
       </w:r>
       <w:proofErr w:type="spellStart"/>
       <w:r>
@@ -19027,23 +18334,7 @@
       </w:r>
       <w:proofErr w:type="spellEnd"/>
       <w:r>
-        <w:t xml:space="preserve"> Sciences </w:t>
-      </w:r>
-      <w:proofErr w:type="gramStart"/>
-      <w:r>
-        <w:t>Publications,</w:t>
-      </w:r>
-      <w:proofErr w:type="gramEnd"/>
-      <w:r>
-        <w:t xml:space="preserve"> Ltd (n.d.). Appendix 3—table 1. Reference parameter set used for the model Equations 17–</w:t>
-      </w:r>
-      <w:proofErr w:type="gramStart"/>
-      <w:r>
-        <w:t>19..</w:t>
-      </w:r>
-      <w:proofErr w:type="gramEnd"/>
-      <w:r>
-        <w:t xml:space="preserve"> </w:t>
+        <w:t xml:space="preserve"> Sciences Publications, Ltd (n.d.). Appendix 3—table 1. Reference parameter set used for the model Equations 17–19.. </w:t>
       </w:r>
       <w:proofErr w:type="spellStart"/>
       <w:r>
@@ -19064,15 +18355,7 @@
       </w:r>
       <w:proofErr w:type="spellEnd"/>
       <w:r>
-        <w:t xml:space="preserve"> (n.d.). Table 2: Some crucial hyperparameters of model </w:t>
-      </w:r>
-      <w:proofErr w:type="gramStart"/>
-      <w:r>
-        <w:t>training..</w:t>
-      </w:r>
-      <w:proofErr w:type="gramEnd"/>
-      <w:r>
-        <w:t xml:space="preserve"> </w:t>
+        <w:t xml:space="preserve"> (n.d.). Table 2: Some crucial hyperparameters of model training.. </w:t>
       </w:r>
       <w:proofErr w:type="spellStart"/>
       <w:r>
@@ -19093,23 +18376,7 @@
       </w:r>
       <w:proofErr w:type="spellEnd"/>
       <w:r>
-        <w:t xml:space="preserve"> Sciences </w:t>
-      </w:r>
-      <w:proofErr w:type="gramStart"/>
-      <w:r>
-        <w:t>Publications,</w:t>
-      </w:r>
-      <w:proofErr w:type="gramEnd"/>
-      <w:r>
-        <w:t xml:space="preserve"> Ltd (n.d.). Figure 3—source data 1. Parameter values used in the fitness model in Figure 3</w:t>
-      </w:r>
-      <w:proofErr w:type="gramStart"/>
-      <w:r>
-        <w:t>B..</w:t>
-      </w:r>
-      <w:proofErr w:type="gramEnd"/>
-      <w:r>
-        <w:t xml:space="preserve"> </w:t>
+        <w:t xml:space="preserve"> Sciences Publications, Ltd (n.d.). Figure 3—source data 1. Parameter values used in the fitness model in Figure 3B.. </w:t>
       </w:r>
       <w:proofErr w:type="spellStart"/>
       <w:r>
@@ -19130,15 +18397,7 @@
       </w:r>
       <w:proofErr w:type="spellEnd"/>
       <w:r>
-        <w:t xml:space="preserve"> (n.d.). Table 4: Training hyperparameters and compilation parameters used in the CNN </w:t>
-      </w:r>
-      <w:proofErr w:type="gramStart"/>
-      <w:r>
-        <w:t>model..</w:t>
-      </w:r>
-      <w:proofErr w:type="gramEnd"/>
-      <w:r>
-        <w:t xml:space="preserve"> </w:t>
+        <w:t xml:space="preserve"> (n.d.). Table 4: Training hyperparameters and compilation parameters used in the CNN model.. </w:t>
       </w:r>
       <w:proofErr w:type="spellStart"/>
       <w:r>
@@ -19192,15 +18451,7 @@
         <w:spacing w:line="480" w:lineRule="auto"/>
       </w:pPr>
       <w:r>
-        <w:t xml:space="preserve">American Association for the Advancement of Science (AAAS) (2026). An AI can invent entirely new languages. But is it </w:t>
-      </w:r>
-      <w:proofErr w:type="gramStart"/>
-      <w:r>
-        <w:t>creative?.</w:t>
-      </w:r>
-      <w:proofErr w:type="gramEnd"/>
-      <w:r>
-        <w:t xml:space="preserve"> AAAS Articles DO Group. https://doi.org/10.1126/science.ztn1cbn</w:t>
+        <w:t>American Association for the Advancement of Science (AAAS) (2026). An AI can invent entirely new languages. But is it creative?. AAAS Articles DO Group. https://doi.org/10.1126/science.ztn1cbn</w:t>
       </w:r>
     </w:p>
     <w:p>
@@ -19216,15 +18467,7 @@
         <w:spacing w:line="480" w:lineRule="auto"/>
       </w:pPr>
       <w:r>
-        <w:t xml:space="preserve">Gunderman, R. (2015). Calling Dr Droid? Why aren’t there any human doctors in Star </w:t>
-      </w:r>
-      <w:proofErr w:type="gramStart"/>
-      <w:r>
-        <w:t>Wars?.</w:t>
-      </w:r>
-      <w:proofErr w:type="gramEnd"/>
-      <w:r>
-        <w:t xml:space="preserve"> The Conversation Media Group Ltd. https://doi.org/10.64628/aai.rugvkp9au</w:t>
+        <w:t>Gunderman, R. (2015). Calling Dr Droid? Why aren’t there any human doctors in Star Wars?. The Conversation Media Group Ltd. https://doi.org/10.64628/aai.rugvkp9au</w:t>
       </w:r>
     </w:p>
     <w:p>
@@ -19248,23 +18491,7 @@
         <w:spacing w:line="480" w:lineRule="auto"/>
       </w:pPr>
       <w:r>
-        <w:t xml:space="preserve">Islam, G. (2021). Can AIs do </w:t>
-      </w:r>
-      <w:proofErr w:type="gramStart"/>
-      <w:r>
-        <w:t>politics?.</w:t>
-      </w:r>
-      <w:proofErr w:type="gramEnd"/>
-      <w:r>
-        <w:t xml:space="preserve"> What is Essential to Being </w:t>
-      </w:r>
-      <w:proofErr w:type="gramStart"/>
-      <w:r>
-        <w:t>Human?.</w:t>
-      </w:r>
-      <w:proofErr w:type="gramEnd"/>
-      <w:r>
-        <w:t xml:space="preserve"> https://doi.org/10.4324/9780429351563-8</w:t>
+        <w:t>Islam, G. (2021). Can AIs do politics?. What is Essential to Being Human?. https://doi.org/10.4324/9780429351563-8</w:t>
       </w:r>
     </w:p>
     <w:p>
@@ -19294,19 +18521,11 @@
       </w:r>
       <w:proofErr w:type="spellStart"/>
       <w:r>
-        <w:t>Writing&amp;</w:t>
-      </w:r>
-      <w:proofErr w:type="gramStart"/>
-      <w:r>
-        <w:t>amp</w:t>
-      </w:r>
-      <w:proofErr w:type="spellEnd"/>
-      <w:r>
-        <w:t>;#</w:t>
-      </w:r>
-      <w:proofErr w:type="gramEnd"/>
-      <w:r>
-        <w:t>x3a; Generative Practices for Teaching, Learning, and Communication. https://doi.org/10.37514/per-b.2026.2777.2.26</w:t>
+        <w:t>Writing&amp;amp</w:t>
+      </w:r>
+      <w:proofErr w:type="spellEnd"/>
+      <w:r>
+        <w:t>;#x3a; Generative Practices for Teaching, Learning, and Communication. https://doi.org/10.37514/per-b.2026.2777.2.26</w:t>
       </w:r>
     </w:p>
     <w:p>
@@ -19343,23 +18562,7 @@
       </w:r>
       <w:proofErr w:type="spellEnd"/>
       <w:r>
-        <w:t xml:space="preserve">, N. (2026). Why Policy Must Emerge </w:t>
-      </w:r>
-      <w:proofErr w:type="gramStart"/>
-      <w:r>
-        <w:t>From</w:t>
-      </w:r>
-      <w:proofErr w:type="gramEnd"/>
-      <w:r>
-        <w:t xml:space="preserve"> </w:t>
-      </w:r>
-      <w:proofErr w:type="gramStart"/>
-      <w:r>
-        <w:t>the Problem</w:t>
-      </w:r>
-      <w:proofErr w:type="gramEnd"/>
-      <w:r>
-        <w:t xml:space="preserve"> Space. Elsevier BV. https://doi.org/10.2139/ssrn.6073847</w:t>
+        <w:t>, N. (2026). Why Policy Must Emerge From the Problem Space. Elsevier BV. https://doi.org/10.2139/ssrn.6073847</w:t>
       </w:r>
     </w:p>
     <w:p>
@@ -19375,15 +18578,7 @@
         <w:spacing w:line="480" w:lineRule="auto"/>
       </w:pPr>
       <w:r>
-        <w:t xml:space="preserve">Bristol University Press (2025). </w:t>
-      </w:r>
-      <w:proofErr w:type="gramStart"/>
-      <w:r>
-        <w:t>Introduction:.</w:t>
-      </w:r>
-      <w:proofErr w:type="gramEnd"/>
-      <w:r>
-        <w:t xml:space="preserve"> You Must Become an Algorithmic Problem. https://doi.org/10.2307/jj.26193007.3</w:t>
+        <w:t>Bristol University Press (2025). Introduction:. You Must Become an Algorithmic Problem. https://doi.org/10.2307/jj.26193007.3</w:t>
       </w:r>
     </w:p>
     <w:p>
@@ -19518,15 +18713,7 @@
       </w:r>
       <w:proofErr w:type="spellEnd"/>
       <w:r>
-        <w:t xml:space="preserve"> (n.d.). Table 2: Structured prompt for GPT-based aspect and sentiment labeling of review </w:t>
-      </w:r>
-      <w:proofErr w:type="gramStart"/>
-      <w:r>
-        <w:t>sentences..</w:t>
-      </w:r>
-      <w:proofErr w:type="gramEnd"/>
-      <w:r>
-        <w:t xml:space="preserve"> </w:t>
+        <w:t xml:space="preserve"> (n.d.). Table 2: Structured prompt for GPT-based aspect and sentiment labeling of review sentences.. </w:t>
       </w:r>
       <w:proofErr w:type="spellStart"/>
       <w:r>
@@ -19627,23 +18814,7 @@
         <w:spacing w:line="480" w:lineRule="auto"/>
       </w:pPr>
       <w:r>
-        <w:t xml:space="preserve">Health </w:t>
-      </w:r>
-      <w:proofErr w:type="gramStart"/>
-      <w:r>
-        <w:t>Affairs Publishing</w:t>
-      </w:r>
-      <w:proofErr w:type="gramEnd"/>
-      <w:r>
-        <w:t xml:space="preserve">, LLC (2015). How Menu Labeling Could Spark Change Beyond </w:t>
-      </w:r>
-      <w:proofErr w:type="gramStart"/>
-      <w:r>
-        <w:t>The</w:t>
-      </w:r>
-      <w:proofErr w:type="gramEnd"/>
-      <w:r>
-        <w:t xml:space="preserve"> Menu Board. Forefront Group. https://doi.org/10.1377/forefront.20150224.044654</w:t>
+        <w:t>Health Affairs Publishing, LLC (2015). How Menu Labeling Could Spark Change Beyond The Menu Board. Forefront Group. https://doi.org/10.1377/forefront.20150224.044654</w:t>
       </w:r>
     </w:p>
     <w:p>
@@ -19715,15 +18886,7 @@
         <w:spacing w:line="480" w:lineRule="auto"/>
       </w:pPr>
       <w:r>
-        <w:t xml:space="preserve">Mazurowski, M. A. (2021). Do We Expect More from Radiology AI than from </w:t>
-      </w:r>
-      <w:proofErr w:type="gramStart"/>
-      <w:r>
-        <w:t>Radiologists?.</w:t>
-      </w:r>
-      <w:proofErr w:type="gramEnd"/>
-      <w:r>
-        <w:t xml:space="preserve"> Radiology: Artificial Intelligence. https://doi.org/10.1148/ryai.2021200221</w:t>
+        <w:t>Mazurowski, M. A. (2021). Do We Expect More from Radiology AI than from Radiologists?. Radiology: Artificial Intelligence. https://doi.org/10.1148/ryai.2021200221</w:t>
       </w:r>
     </w:p>
     <w:p>
@@ -19830,15 +18993,7 @@
       </w:r>
       <w:proofErr w:type="spellEnd"/>
       <w:r>
-        <w:t xml:space="preserve">, C. A. (n.d.). The Tahltan Nation and our consultation process with mining industry: How a land use plan might improve the </w:t>
-      </w:r>
-      <w:proofErr w:type="gramStart"/>
-      <w:r>
-        <w:t>process..</w:t>
-      </w:r>
-      <w:proofErr w:type="gramEnd"/>
-      <w:r>
-        <w:t xml:space="preserve"> University of Northern British Columbia. https://doi.org/10.24124/2011/bpgub765</w:t>
+        <w:t>, C. A. (n.d.). The Tahltan Nation and our consultation process with mining industry: How a land use plan might improve the process.. University of Northern British Columbia. https://doi.org/10.24124/2011/bpgub765</w:t>
       </w:r>
     </w:p>
     <w:p>
@@ -19876,15 +19031,7 @@
       </w:r>
       <w:proofErr w:type="spellEnd"/>
       <w:r>
-        <w:t xml:space="preserve">, S. E., &amp; Lockett, A. (2024). Reshaping consent so we might improve participant choice (III) – How is the research participant’s understanding currently checked and how might we improve this </w:t>
-      </w:r>
-      <w:proofErr w:type="gramStart"/>
-      <w:r>
-        <w:t>process?.</w:t>
-      </w:r>
-      <w:proofErr w:type="gramEnd"/>
-      <w:r>
-        <w:t xml:space="preserve"> Research Ethics. https://doi.org/10.1177/17470161241235910</w:t>
+        <w:t>, S. E., &amp; Lockett, A. (2024). Reshaping consent so we might improve participant choice (III) – How is the research participant’s understanding currently checked and how might we improve this process?. Research Ethics. https://doi.org/10.1177/17470161241235910</w:t>
       </w:r>
     </w:p>
     <w:p>
@@ -20067,15 +19214,7 @@
         <w:spacing w:line="480" w:lineRule="auto"/>
       </w:pPr>
       <w:r>
-        <w:t xml:space="preserve">D'Mello, S., McCauley, L., &amp; Markham, J. (n.d.). A mechanism for human - robot interaction through informal voice commands. ROMAN 2005. IEEE International Workshop on Robot and Human Interactive Communication, </w:t>
-      </w:r>
-      <w:proofErr w:type="gramStart"/>
-      <w:r>
-        <w:t>2005..</w:t>
-      </w:r>
-      <w:proofErr w:type="gramEnd"/>
-      <w:r>
-        <w:t xml:space="preserve"> https://doi.org/10.1109/roman.2005.1513777</w:t>
+        <w:t>D'Mello, S., McCauley, L., &amp; Markham, J. (n.d.). A mechanism for human - robot interaction through informal voice commands. ROMAN 2005. IEEE International Workshop on Robot and Human Interactive Communication, 2005.. https://doi.org/10.1109/roman.2005.1513777</w:t>
       </w:r>
     </w:p>
     <w:p>
@@ -20174,15 +19313,7 @@
       </w:r>
       <w:proofErr w:type="spellEnd"/>
       <w:r>
-        <w:t xml:space="preserve">, C., &amp; Chen, J. (2025). Willingness to communicate </w:t>
-      </w:r>
-      <w:proofErr w:type="gramStart"/>
-      <w:r>
-        <w:t>and</w:t>
-      </w:r>
-      <w:proofErr w:type="gramEnd"/>
-      <w:r>
-        <w:t xml:space="preserve"> anxiety in human–human and human–chatbot interaction contexts: an </w:t>
+        <w:t xml:space="preserve">, C., &amp; Chen, J. (2025). Willingness to communicate and anxiety in human–human and human–chatbot interaction contexts: an </w:t>
       </w:r>
       <w:proofErr w:type="spellStart"/>
       <w:r>
@@ -20212,15 +19343,7 @@
       </w:r>
       <w:proofErr w:type="spellEnd"/>
       <w:r>
-        <w:t xml:space="preserve"> Group LLC (2024). Detecting Similar Complex Data Structures in Large-Scale Datasets. Current Research in Statistics &amp;</w:t>
-      </w:r>
-      <w:proofErr w:type="gramStart"/>
-      <w:r>
-        <w:t>amp</w:t>
-      </w:r>
-      <w:proofErr w:type="gramEnd"/>
-      <w:r>
-        <w:t>; Mathematics. https://doi.org/10.33140/crsm.03.02.03</w:t>
+        <w:t xml:space="preserve"> Group LLC (2024). Detecting Similar Complex Data Structures in Large-Scale Datasets. Current Research in Statistics &amp;amp; Mathematics. https://doi.org/10.33140/crsm.03.02.03</w:t>
       </w:r>
     </w:p>
     <w:p>
@@ -20260,23 +19383,7 @@
       </w:r>
       <w:proofErr w:type="spellEnd"/>
       <w:r>
-        <w:t xml:space="preserve">, P., &amp; Hart, D. (2024). Big Data Processing Platform for Large Acoustic Datasets and Complex Data Pipelines: Leveraging Cutting Edge </w:t>
-      </w:r>
-      <w:proofErr w:type="gramStart"/>
-      <w:r>
-        <w:t>Open Source</w:t>
-      </w:r>
-      <w:proofErr w:type="gramEnd"/>
-      <w:r>
-        <w:t xml:space="preserve"> Software to Build Scalable </w:t>
-      </w:r>
-      <w:proofErr w:type="gramStart"/>
-      <w:r>
-        <w:t>Cost Effective</w:t>
-      </w:r>
-      <w:proofErr w:type="gramEnd"/>
-      <w:r>
-        <w:t xml:space="preserve"> Solutions. OCEANS 2024 - Halifax. https://doi.org/10.1109/oceans55160.2024.10754471</w:t>
+        <w:t>, P., &amp; Hart, D. (2024). Big Data Processing Platform for Large Acoustic Datasets and Complex Data Pipelines: Leveraging Cutting Edge Open Source Software to Build Scalable Cost Effective Solutions. OCEANS 2024 - Halifax. https://doi.org/10.1109/oceans55160.2024.10754471</w:t>
       </w:r>
     </w:p>
     <w:p>
@@ -20312,31 +19419,7 @@
         <w:spacing w:line="480" w:lineRule="auto"/>
       </w:pPr>
       <w:r>
-        <w:t xml:space="preserve">Qin, X. (n.d.). Clustering And Classification </w:t>
-      </w:r>
-      <w:proofErr w:type="gramStart"/>
-      <w:r>
-        <w:t>Of</w:t>
-      </w:r>
-      <w:proofErr w:type="gramEnd"/>
-      <w:r>
-        <w:t xml:space="preserve"> Complex Datasets </w:t>
-      </w:r>
-      <w:proofErr w:type="gramStart"/>
-      <w:r>
-        <w:t>With</w:t>
-      </w:r>
-      <w:proofErr w:type="gramEnd"/>
-      <w:r>
-        <w:t xml:space="preserve"> Applications </w:t>
-      </w:r>
-      <w:proofErr w:type="gramStart"/>
-      <w:r>
-        <w:t>In</w:t>
-      </w:r>
-      <w:proofErr w:type="gramEnd"/>
-      <w:r>
-        <w:t xml:space="preserve"> Crime, Microbiome, And Raman Spectroscopy Data. Carleton University. https://doi.org/10.22215/etd/2025-16818</w:t>
+        <w:t>Qin, X. (n.d.). Clustering And Classification Of Complex Datasets With Applications In Crime, Microbiome, And Raman Spectroscopy Data. Carleton University. https://doi.org/10.22215/etd/2025-16818</w:t>
       </w:r>
     </w:p>
     <w:p>
@@ -20384,15 +19467,7 @@
       </w:r>
       <w:proofErr w:type="spellEnd"/>
       <w:r>
-        <w:t xml:space="preserve"> More Accurately Than Conventional Regulatory Assumptions in Funds Transfer Pricing </w:t>
-      </w:r>
-      <w:proofErr w:type="gramStart"/>
-      <w:r>
-        <w:t>Frameworks?.</w:t>
-      </w:r>
-      <w:proofErr w:type="gramEnd"/>
-      <w:r>
-        <w:t xml:space="preserve"> Elsevier BV. https://doi.org/10.2139/ssrn.7260700</w:t>
+        <w:t xml:space="preserve"> More Accurately Than Conventional Regulatory Assumptions in Funds Transfer Pricing Frameworks?. Elsevier BV. https://doi.org/10.2139/ssrn.7260700</w:t>
       </w:r>
     </w:p>
     <w:p>
@@ -20421,15 +19496,7 @@
       </w:r>
       <w:proofErr w:type="spellEnd"/>
       <w:r>
-        <w:t xml:space="preserve"> (n.d.). Table 9: The assumptions made by the TM </w:t>
-      </w:r>
-      <w:proofErr w:type="gramStart"/>
-      <w:r>
-        <w:t>models..</w:t>
-      </w:r>
-      <w:proofErr w:type="gramEnd"/>
-      <w:r>
-        <w:t xml:space="preserve"> </w:t>
+        <w:t xml:space="preserve"> (n.d.). Table 9: The assumptions made by the TM models.. </w:t>
       </w:r>
       <w:proofErr w:type="spellStart"/>
       <w:r>
@@ -20454,31 +19521,15 @@
         <w:spacing w:line="480" w:lineRule="auto"/>
       </w:pPr>
       <w:r>
-        <w:t xml:space="preserve">Li, C., &amp; Jiang, X. (2023). Unmasking Assumptions- Evaluating the Impact of Data Augmentation on Machine Learning Models in Healthcare Datasets (Preprint). JMIR Publications </w:t>
-      </w:r>
-      <w:proofErr w:type="gramStart"/>
-      <w:r>
-        <w:t>Inc..</w:t>
-      </w:r>
-      <w:proofErr w:type="gramEnd"/>
-      <w:r>
-        <w:t xml:space="preserve"> https://doi.org/10.2196/preprints.50042</w:t>
-      </w:r>
-    </w:p>
-    <w:p>
-      <w:pPr>
-        <w:spacing w:line="480" w:lineRule="auto"/>
-      </w:pPr>
-      <w:r>
-        <w:t xml:space="preserve">American Psychological Association (APA) (2020). Supplemental Material for Can the Stimulus Processing Assumptions of the Sometimes-Opponent-Process (SOP) Model Explain Instances of Contextual </w:t>
-      </w:r>
-      <w:proofErr w:type="gramStart"/>
-      <w:r>
-        <w:t>Learning?.</w:t>
-      </w:r>
-      <w:proofErr w:type="gramEnd"/>
-      <w:r>
-        <w:t xml:space="preserve"> Journal of Experimental Psychology: Animal Learning and Cognition. https://doi.org/10.1037/xan0000251.supp</w:t>
+        <w:t>Li, C., &amp; Jiang, X. (2023). Unmasking Assumptions- Evaluating the Impact of Data Augmentation on Machine Learning Models in Healthcare Datasets (Preprint). JMIR Publications Inc.. https://doi.org/10.2196/preprints.50042</w:t>
+      </w:r>
+    </w:p>
+    <w:p>
+      <w:pPr>
+        <w:spacing w:line="480" w:lineRule="auto"/>
+      </w:pPr>
+      <w:r>
+        <w:t>American Psychological Association (APA) (2020). Supplemental Material for Can the Stimulus Processing Assumptions of the Sometimes-Opponent-Process (SOP) Model Explain Instances of Contextual Learning?. Journal of Experimental Psychology: Animal Learning and Cognition. https://doi.org/10.1037/xan0000251.supp</w:t>
       </w:r>
     </w:p>
     <w:p>
@@ -20551,15 +19602,7 @@
         <w:spacing w:line="480" w:lineRule="auto"/>
       </w:pPr>
       <w:r>
-        <w:t xml:space="preserve">Boero, F. (2021). Faculty Opinions recommendation of Where might we find ecologically intact </w:t>
-      </w:r>
-      <w:proofErr w:type="gramStart"/>
-      <w:r>
-        <w:t>communities?.</w:t>
-      </w:r>
-      <w:proofErr w:type="gramEnd"/>
-      <w:r>
-        <w:t xml:space="preserve"> Faculty Opinions – Post-Publication Peer Review of the Biomedical Literature. https://doi.org/10.3410/f.739949900.793585058</w:t>
+        <w:t>Boero, F. (2021). Faculty Opinions recommendation of Where might we find ecologically intact communities?. Faculty Opinions – Post-Publication Peer Review of the Biomedical Literature. https://doi.org/10.3410/f.739949900.793585058</w:t>
       </w:r>
     </w:p>
     <w:p>
@@ -20599,23 +19642,7 @@
         <w:spacing w:line="480" w:lineRule="auto"/>
       </w:pPr>
       <w:r>
-        <w:t xml:space="preserve">Kubo, H., Bauder, J., &amp; Bauder, J. (2022). Who Might Have the Data I </w:t>
-      </w:r>
-      <w:proofErr w:type="gramStart"/>
-      <w:r>
-        <w:t>Want?.</w:t>
-      </w:r>
-      <w:proofErr w:type="gramEnd"/>
-      <w:r>
-        <w:t xml:space="preserve"> How Can You Find </w:t>
-      </w:r>
-      <w:proofErr w:type="gramStart"/>
-      <w:r>
-        <w:t>Data?.</w:t>
-      </w:r>
-      <w:proofErr w:type="gramEnd"/>
-      <w:r>
-        <w:t xml:space="preserve"> https://doi.org/10.4135/9781071904558</w:t>
+        <w:t>Kubo, H., Bauder, J., &amp; Bauder, J. (2022). Who Might Have the Data I Want?. How Can You Find Data?. https://doi.org/10.4135/9781071904558</w:t>
       </w:r>
     </w:p>
     <w:p>
@@ -20647,15 +19674,7 @@
         <w:spacing w:line="480" w:lineRule="auto"/>
       </w:pPr>
       <w:r>
-        <w:t xml:space="preserve">Zoro, R. (2026). Where can I find the lowest price on Starz? {{Get assistance from our support </w:t>
-      </w:r>
-      <w:proofErr w:type="gramStart"/>
-      <w:r>
-        <w:t>staff}}.</w:t>
-      </w:r>
-      <w:proofErr w:type="gramEnd"/>
-      <w:r>
-        <w:t xml:space="preserve"> </w:t>
+        <w:t xml:space="preserve">Zoro, R. (2026). Where can I find the lowest price on Starz? {{Get assistance from our support staff}}. </w:t>
       </w:r>
       <w:proofErr w:type="spellStart"/>
       <w:r>
@@ -20663,15 +19682,7 @@
       </w:r>
       <w:proofErr w:type="spellEnd"/>
       <w:r>
-        <w:t xml:space="preserve"> Technologies, </w:t>
-      </w:r>
-      <w:proofErr w:type="gramStart"/>
-      <w:r>
-        <w:t>Inc..</w:t>
-      </w:r>
-      <w:proofErr w:type="gramEnd"/>
-      <w:r>
-        <w:t xml:space="preserve"> https://doi.org/10.55277/researchhub.olvnzy2x</w:t>
+        <w:t xml:space="preserve"> Technologies, Inc.. https://doi.org/10.55277/researchhub.olvnzy2x</w:t>
       </w:r>
     </w:p>
     <w:p>
@@ -20680,23 +19691,7 @@
       </w:pPr>
       <w:r>
         <w:lastRenderedPageBreak/>
-        <w:t xml:space="preserve">SAGE Publications Ltd (2018). Money, money, money! Where can we find </w:t>
-      </w:r>
-      <w:proofErr w:type="gramStart"/>
-      <w:r>
-        <w:t>the financial</w:t>
-      </w:r>
-      <w:proofErr w:type="gramEnd"/>
-      <w:r>
-        <w:t xml:space="preserve"> support for our </w:t>
-      </w:r>
-      <w:proofErr w:type="gramStart"/>
-      <w:r>
-        <w:t>plans?.</w:t>
-      </w:r>
-      <w:proofErr w:type="gramEnd"/>
-      <w:r>
-        <w:t xml:space="preserve"> Local Regeneration Handbook. https://doi.org/10.4135/9781526428769.n11</w:t>
+        <w:t>SAGE Publications Ltd (2018). Money, money, money! Where can we find the financial support for our plans?. Local Regeneration Handbook. https://doi.org/10.4135/9781526428769.n11</w:t>
       </w:r>
     </w:p>
     <w:p>
@@ -21130,15 +20125,7 @@
       </w:r>
       <w:proofErr w:type="spellEnd"/>
       <w:r>
-        <w:t xml:space="preserve">, B., &amp; Lefebvre, L. (2010). Why do users communicate via such or such </w:t>
-      </w:r>
-      <w:proofErr w:type="gramStart"/>
-      <w:r>
-        <w:t>media?.</w:t>
-      </w:r>
-      <w:proofErr w:type="gramEnd"/>
-      <w:r>
-        <w:t xml:space="preserve"> Proceedings of the 6th Nordic Conference on Human-Computer Interaction: Extending Boundaries. https://doi.org/10.1145/1868914.1868990</w:t>
+        <w:t>, B., &amp; Lefebvre, L. (2010). Why do users communicate via such or such media?. Proceedings of the 6th Nordic Conference on Human-Computer Interaction: Extending Boundaries. https://doi.org/10.1145/1868914.1868990</w:t>
       </w:r>
     </w:p>
     <w:p>
@@ -21205,15 +20192,7 @@
       </w:r>
       <w:proofErr w:type="spellEnd"/>
       <w:r>
-        <w:t xml:space="preserve"> (n.d.). Table 3: Table of hyperparameters values used in each </w:t>
-      </w:r>
-      <w:proofErr w:type="gramStart"/>
-      <w:r>
-        <w:t>model..</w:t>
-      </w:r>
-      <w:proofErr w:type="gramEnd"/>
-      <w:r>
-        <w:t xml:space="preserve"> </w:t>
+        <w:t xml:space="preserve"> (n.d.). Table 3: Table of hyperparameters values used in each model.. </w:t>
       </w:r>
       <w:proofErr w:type="spellStart"/>
       <w:r>
@@ -21234,15 +20213,7 @@
       </w:r>
       <w:proofErr w:type="spellEnd"/>
       <w:r>
-        <w:t xml:space="preserve"> (n.d.). Table 1: Default values for some hyperparameters used in the </w:t>
-      </w:r>
-      <w:proofErr w:type="gramStart"/>
-      <w:r>
-        <w:t>experiments..</w:t>
-      </w:r>
-      <w:proofErr w:type="gramEnd"/>
-      <w:r>
-        <w:t xml:space="preserve"> </w:t>
+        <w:t xml:space="preserve"> (n.d.). Table 1: Default values for some hyperparameters used in the experiments.. </w:t>
       </w:r>
       <w:proofErr w:type="spellStart"/>
       <w:r>
@@ -21263,15 +20234,7 @@
       </w:r>
       <w:proofErr w:type="spellEnd"/>
       <w:r>
-        <w:t xml:space="preserve"> (n.d.). Supplemental Information 11: Hyperparameters for each model used. Values marked with * indicate the final hyperparameter configuration used for reporting </w:t>
-      </w:r>
-      <w:proofErr w:type="gramStart"/>
-      <w:r>
-        <w:t>results..</w:t>
-      </w:r>
-      <w:proofErr w:type="gramEnd"/>
-      <w:r>
-        <w:t xml:space="preserve"> </w:t>
+        <w:t xml:space="preserve"> (n.d.). Supplemental Information 11: Hyperparameters for each model used. Values marked with * indicate the final hyperparameter configuration used for reporting results.. </w:t>
       </w:r>
       <w:proofErr w:type="spellStart"/>
       <w:r>
@@ -21292,15 +20255,7 @@
       </w:r>
       <w:proofErr w:type="spellEnd"/>
       <w:r>
-        <w:t xml:space="preserve"> (n.d.). Table 2: Hyperparameters used in proposed </w:t>
-      </w:r>
-      <w:proofErr w:type="gramStart"/>
-      <w:r>
-        <w:t>model..</w:t>
-      </w:r>
-      <w:proofErr w:type="gramEnd"/>
-      <w:r>
-        <w:t xml:space="preserve"> </w:t>
+        <w:t xml:space="preserve"> (n.d.). Table 2: Hyperparameters used in proposed model.. </w:t>
       </w:r>
       <w:proofErr w:type="spellStart"/>
       <w:r>
@@ -21321,15 +20276,7 @@
       </w:r>
       <w:proofErr w:type="spellEnd"/>
       <w:r>
-        <w:t xml:space="preserve"> (n.d.). Table 1: Hyperparameters used in the proposed </w:t>
-      </w:r>
-      <w:proofErr w:type="gramStart"/>
-      <w:r>
-        <w:t>model..</w:t>
-      </w:r>
-      <w:proofErr w:type="gramEnd"/>
-      <w:r>
-        <w:t xml:space="preserve"> </w:t>
+        <w:t xml:space="preserve"> (n.d.). Table 1: Hyperparameters used in the proposed model.. </w:t>
       </w:r>
       <w:proofErr w:type="spellStart"/>
       <w:r>
@@ -21351,23 +20298,7 @@
       </w:r>
       <w:proofErr w:type="spellEnd"/>
       <w:r>
-        <w:t xml:space="preserve"> Sciences </w:t>
-      </w:r>
-      <w:proofErr w:type="gramStart"/>
-      <w:r>
-        <w:t>Publications,</w:t>
-      </w:r>
-      <w:proofErr w:type="gramEnd"/>
-      <w:r>
-        <w:t xml:space="preserve"> Ltd (n.d.). Figure 1—source data 1. Parameter values used in the fitness </w:t>
-      </w:r>
-      <w:proofErr w:type="gramStart"/>
-      <w:r>
-        <w:t>model..</w:t>
-      </w:r>
-      <w:proofErr w:type="gramEnd"/>
-      <w:r>
-        <w:t xml:space="preserve"> </w:t>
+        <w:t xml:space="preserve"> Sciences Publications, Ltd (n.d.). Figure 1—source data 1. Parameter values used in the fitness model.. </w:t>
       </w:r>
       <w:proofErr w:type="spellStart"/>
       <w:r>
@@ -21388,23 +20319,7 @@
       </w:r>
       <w:proofErr w:type="spellEnd"/>
       <w:r>
-        <w:t xml:space="preserve"> Sciences </w:t>
-      </w:r>
-      <w:proofErr w:type="gramStart"/>
-      <w:r>
-        <w:t>Publications,</w:t>
-      </w:r>
-      <w:proofErr w:type="gramEnd"/>
-      <w:r>
-        <w:t xml:space="preserve"> Ltd (n.d.). Figure 2—source data 1. Parameter values used in the diffusion model </w:t>
-      </w:r>
-      <w:proofErr w:type="gramStart"/>
-      <w:r>
-        <w:t>simulations..</w:t>
-      </w:r>
-      <w:proofErr w:type="gramEnd"/>
-      <w:r>
-        <w:t xml:space="preserve"> </w:t>
+        <w:t xml:space="preserve"> Sciences Publications, Ltd (n.d.). Figure 2—source data 1. Parameter values used in the diffusion model simulations.. </w:t>
       </w:r>
       <w:proofErr w:type="spellStart"/>
       <w:r>
@@ -21425,15 +20340,7 @@
       </w:r>
       <w:proofErr w:type="spellEnd"/>
       <w:r>
-        <w:t xml:space="preserve"> (n.d.). Table 5: Fine-tuned hyperparameters values for Urdu-NERD </w:t>
-      </w:r>
-      <w:proofErr w:type="gramStart"/>
-      <w:r>
-        <w:t>model..</w:t>
-      </w:r>
-      <w:proofErr w:type="gramEnd"/>
-      <w:r>
-        <w:t xml:space="preserve"> </w:t>
+        <w:t xml:space="preserve"> (n.d.). Table 5: Fine-tuned hyperparameters values for Urdu-NERD model.. </w:t>
       </w:r>
       <w:proofErr w:type="spellStart"/>
       <w:r>
@@ -21454,23 +20361,7 @@
       </w:r>
       <w:proofErr w:type="spellEnd"/>
       <w:r>
-        <w:t xml:space="preserve"> Sciences </w:t>
-      </w:r>
-      <w:proofErr w:type="gramStart"/>
-      <w:r>
-        <w:t>Publications,</w:t>
-      </w:r>
-      <w:proofErr w:type="gramEnd"/>
-      <w:r>
-        <w:t xml:space="preserve"> Ltd (n.d.). Appendix 3—table 1. Reference parameter set used for the model Equations 17–</w:t>
-      </w:r>
-      <w:proofErr w:type="gramStart"/>
-      <w:r>
-        <w:t>19..</w:t>
-      </w:r>
-      <w:proofErr w:type="gramEnd"/>
-      <w:r>
-        <w:t xml:space="preserve"> </w:t>
+        <w:t xml:space="preserve"> Sciences Publications, Ltd (n.d.). Appendix 3—table 1. Reference parameter set used for the model Equations 17–19.. </w:t>
       </w:r>
       <w:proofErr w:type="spellStart"/>
       <w:r>
@@ -21491,15 +20382,7 @@
       </w:r>
       <w:proofErr w:type="spellEnd"/>
       <w:r>
-        <w:t xml:space="preserve"> (n.d.). Table 2: Some crucial hyperparameters of model </w:t>
-      </w:r>
-      <w:proofErr w:type="gramStart"/>
-      <w:r>
-        <w:t>training..</w:t>
-      </w:r>
-      <w:proofErr w:type="gramEnd"/>
-      <w:r>
-        <w:t xml:space="preserve"> </w:t>
+        <w:t xml:space="preserve"> (n.d.). Table 2: Some crucial hyperparameters of model training.. </w:t>
       </w:r>
       <w:proofErr w:type="spellStart"/>
       <w:r>
@@ -21520,23 +20403,7 @@
       </w:r>
       <w:proofErr w:type="spellEnd"/>
       <w:r>
-        <w:t xml:space="preserve"> Sciences </w:t>
-      </w:r>
-      <w:proofErr w:type="gramStart"/>
-      <w:r>
-        <w:t>Publications,</w:t>
-      </w:r>
-      <w:proofErr w:type="gramEnd"/>
-      <w:r>
-        <w:t xml:space="preserve"> Ltd (n.d.). Figure 3—source data 1. Parameter values used in the fitness model in Figure 3</w:t>
-      </w:r>
-      <w:proofErr w:type="gramStart"/>
-      <w:r>
-        <w:t>B..</w:t>
-      </w:r>
-      <w:proofErr w:type="gramEnd"/>
-      <w:r>
-        <w:t xml:space="preserve"> </w:t>
+        <w:t xml:space="preserve"> Sciences Publications, Ltd (n.d.). Figure 3—source data 1. Parameter values used in the fitness model in Figure 3B.. </w:t>
       </w:r>
       <w:proofErr w:type="spellStart"/>
       <w:r>
@@ -21557,15 +20424,7 @@
       </w:r>
       <w:proofErr w:type="spellEnd"/>
       <w:r>
-        <w:t xml:space="preserve"> (n.d.). Table 4: Training hyperparameters and compilation parameters used in the CNN </w:t>
-      </w:r>
-      <w:proofErr w:type="gramStart"/>
-      <w:r>
-        <w:t>model..</w:t>
-      </w:r>
-      <w:proofErr w:type="gramEnd"/>
-      <w:r>
-        <w:t xml:space="preserve"> </w:t>
+        <w:t xml:space="preserve"> (n.d.). Table 4: Training hyperparameters and compilation parameters used in the CNN model.. </w:t>
       </w:r>
       <w:proofErr w:type="spellStart"/>
       <w:r>
@@ -21619,15 +20478,7 @@
         <w:spacing w:line="480" w:lineRule="auto"/>
       </w:pPr>
       <w:r>
-        <w:t xml:space="preserve">American Association for the Advancement of Science (AAAS) (2026). An AI can invent entirely new languages. But is it </w:t>
-      </w:r>
-      <w:proofErr w:type="gramStart"/>
-      <w:r>
-        <w:t>creative?.</w:t>
-      </w:r>
-      <w:proofErr w:type="gramEnd"/>
-      <w:r>
-        <w:t xml:space="preserve"> AAAS Articles DO Group. https://doi.org/10.1126/science.ztn1cbn</w:t>
+        <w:t>American Association for the Advancement of Science (AAAS) (2026). An AI can invent entirely new languages. But is it creative?. AAAS Articles DO Group. https://doi.org/10.1126/science.ztn1cbn</w:t>
       </w:r>
     </w:p>
     <w:p>
@@ -21643,15 +20494,7 @@
         <w:spacing w:line="480" w:lineRule="auto"/>
       </w:pPr>
       <w:r>
-        <w:t xml:space="preserve">Gunderman, R. (2015). Calling Dr Droid? Why aren’t there any human doctors in Star </w:t>
-      </w:r>
-      <w:proofErr w:type="gramStart"/>
-      <w:r>
-        <w:t>Wars?.</w:t>
-      </w:r>
-      <w:proofErr w:type="gramEnd"/>
-      <w:r>
-        <w:t xml:space="preserve"> The Conversation Media Group Ltd. https://doi.org/10.64628/aai.rugvkp9au</w:t>
+        <w:t>Gunderman, R. (2015). Calling Dr Droid? Why aren’t there any human doctors in Star Wars?. The Conversation Media Group Ltd. https://doi.org/10.64628/aai.rugvkp9au</w:t>
       </w:r>
     </w:p>
     <w:p>
@@ -21675,23 +20518,7 @@
         <w:spacing w:line="480" w:lineRule="auto"/>
       </w:pPr>
       <w:r>
-        <w:t xml:space="preserve">Islam, G. (2021). Can AIs do </w:t>
-      </w:r>
-      <w:proofErr w:type="gramStart"/>
-      <w:r>
-        <w:t>politics?.</w:t>
-      </w:r>
-      <w:proofErr w:type="gramEnd"/>
-      <w:r>
-        <w:t xml:space="preserve"> What is Essential to Being </w:t>
-      </w:r>
-      <w:proofErr w:type="gramStart"/>
-      <w:r>
-        <w:t>Human?.</w:t>
-      </w:r>
-      <w:proofErr w:type="gramEnd"/>
-      <w:r>
-        <w:t xml:space="preserve"> https://doi.org/10.4324/9780429351563-8</w:t>
+        <w:t>Islam, G. (2021). Can AIs do politics?. What is Essential to Being Human?. https://doi.org/10.4324/9780429351563-8</w:t>
       </w:r>
     </w:p>
     <w:p>
@@ -21721,19 +20548,11 @@
       </w:r>
       <w:proofErr w:type="spellStart"/>
       <w:r>
-        <w:t>Writing&amp;</w:t>
-      </w:r>
-      <w:proofErr w:type="gramStart"/>
-      <w:r>
-        <w:t>amp</w:t>
-      </w:r>
-      <w:proofErr w:type="spellEnd"/>
-      <w:r>
-        <w:t>;#</w:t>
-      </w:r>
-      <w:proofErr w:type="gramEnd"/>
-      <w:r>
-        <w:t>x3a; Generative Practices for Teaching, Learning, and Communication. https://doi.org/10.37514/per-b.2026.2777.2.26</w:t>
+        <w:t>Writing&amp;amp</w:t>
+      </w:r>
+      <w:proofErr w:type="spellEnd"/>
+      <w:r>
+        <w:t>;#x3a; Generative Practices for Teaching, Learning, and Communication. https://doi.org/10.37514/per-b.2026.2777.2.26</w:t>
       </w:r>
     </w:p>
     <w:p>
@@ -21770,23 +20589,7 @@
       </w:r>
       <w:proofErr w:type="spellEnd"/>
       <w:r>
-        <w:t xml:space="preserve">, N. (2026). Why Policy Must Emerge </w:t>
-      </w:r>
-      <w:proofErr w:type="gramStart"/>
-      <w:r>
-        <w:t>From</w:t>
-      </w:r>
-      <w:proofErr w:type="gramEnd"/>
-      <w:r>
-        <w:t xml:space="preserve"> </w:t>
-      </w:r>
-      <w:proofErr w:type="gramStart"/>
-      <w:r>
-        <w:t>the Problem</w:t>
-      </w:r>
-      <w:proofErr w:type="gramEnd"/>
-      <w:r>
-        <w:t xml:space="preserve"> Space. Elsevier BV. https://doi.org/10.2139/ssrn.6073847</w:t>
+        <w:t>, N. (2026). Why Policy Must Emerge From the Problem Space. Elsevier BV. https://doi.org/10.2139/ssrn.6073847</w:t>
       </w:r>
     </w:p>
     <w:p>
@@ -21802,15 +20605,7 @@
         <w:spacing w:line="480" w:lineRule="auto"/>
       </w:pPr>
       <w:r>
-        <w:t xml:space="preserve">Bristol University Press (2025). </w:t>
-      </w:r>
-      <w:proofErr w:type="gramStart"/>
-      <w:r>
-        <w:t>Introduction:.</w:t>
-      </w:r>
-      <w:proofErr w:type="gramEnd"/>
-      <w:r>
-        <w:t xml:space="preserve"> You Must Become an Algorithmic Problem. https://doi.org/10.2307/jj.26193007.3</w:t>
+        <w:t>Bristol University Press (2025). Introduction:. You Must Become an Algorithmic Problem. https://doi.org/10.2307/jj.26193007.3</w:t>
       </w:r>
     </w:p>
     <w:p>
@@ -21945,15 +20740,7 @@
       </w:r>
       <w:proofErr w:type="spellEnd"/>
       <w:r>
-        <w:t xml:space="preserve"> (n.d.). Table 2: Structured prompt for GPT-based aspect and sentiment labeling of review </w:t>
-      </w:r>
-      <w:proofErr w:type="gramStart"/>
-      <w:r>
-        <w:t>sentences..</w:t>
-      </w:r>
-      <w:proofErr w:type="gramEnd"/>
-      <w:r>
-        <w:t xml:space="preserve"> </w:t>
+        <w:t xml:space="preserve"> (n.d.). Table 2: Structured prompt for GPT-based aspect and sentiment labeling of review sentences.. </w:t>
       </w:r>
       <w:proofErr w:type="spellStart"/>
       <w:r>
@@ -22054,23 +20841,7 @@
         <w:spacing w:line="480" w:lineRule="auto"/>
       </w:pPr>
       <w:r>
-        <w:t xml:space="preserve">Health </w:t>
-      </w:r>
-      <w:proofErr w:type="gramStart"/>
-      <w:r>
-        <w:t>Affairs Publishing</w:t>
-      </w:r>
-      <w:proofErr w:type="gramEnd"/>
-      <w:r>
-        <w:t xml:space="preserve">, LLC (2015). How Menu Labeling Could Spark Change Beyond </w:t>
-      </w:r>
-      <w:proofErr w:type="gramStart"/>
-      <w:r>
-        <w:t>The</w:t>
-      </w:r>
-      <w:proofErr w:type="gramEnd"/>
-      <w:r>
-        <w:t xml:space="preserve"> Menu Board. Forefront Group. https://doi.org/10.1377/forefront.20150224.044654</w:t>
+        <w:t>Health Affairs Publishing, LLC (2015). How Menu Labeling Could Spark Change Beyond The Menu Board. Forefront Group. https://doi.org/10.1377/forefront.20150224.044654</w:t>
       </w:r>
     </w:p>
     <w:p>
@@ -22142,15 +20913,7 @@
         <w:spacing w:line="480" w:lineRule="auto"/>
       </w:pPr>
       <w:r>
-        <w:t xml:space="preserve">Mazurowski, M. A. (2021). Do We Expect More from Radiology AI than from </w:t>
-      </w:r>
-      <w:proofErr w:type="gramStart"/>
-      <w:r>
-        <w:t>Radiologists?.</w:t>
-      </w:r>
-      <w:proofErr w:type="gramEnd"/>
-      <w:r>
-        <w:t xml:space="preserve"> Radiology: Artificial Intelligence. https://doi.org/10.1148/ryai.2021200221</w:t>
+        <w:t>Mazurowski, M. A. (2021). Do We Expect More from Radiology AI than from Radiologists?. Radiology: Artificial Intelligence. https://doi.org/10.1148/ryai.2021200221</w:t>
       </w:r>
     </w:p>
     <w:p>
@@ -22257,15 +21020,7 @@
       </w:r>
       <w:proofErr w:type="spellEnd"/>
       <w:r>
-        <w:t xml:space="preserve">, C. A. (n.d.). The Tahltan Nation and our consultation process with mining industry: How a land use plan might improve the </w:t>
-      </w:r>
-      <w:proofErr w:type="gramStart"/>
-      <w:r>
-        <w:t>process..</w:t>
-      </w:r>
-      <w:proofErr w:type="gramEnd"/>
-      <w:r>
-        <w:t xml:space="preserve"> University of Northern British Columbia. https://doi.org/10.24124/2011/bpgub765</w:t>
+        <w:t>, C. A. (n.d.). The Tahltan Nation and our consultation process with mining industry: How a land use plan might improve the process.. University of Northern British Columbia. https://doi.org/10.24124/2011/bpgub765</w:t>
       </w:r>
     </w:p>
     <w:p>
@@ -22303,15 +21058,7 @@
       </w:r>
       <w:proofErr w:type="spellEnd"/>
       <w:r>
-        <w:t xml:space="preserve">, S. E., &amp; Lockett, A. (2024). Reshaping consent so we might improve participant choice (III) – How is the research participant’s understanding currently checked and how might we improve this </w:t>
-      </w:r>
-      <w:proofErr w:type="gramStart"/>
-      <w:r>
-        <w:t>process?.</w:t>
-      </w:r>
-      <w:proofErr w:type="gramEnd"/>
-      <w:r>
-        <w:t xml:space="preserve"> Research Ethics. https://doi.org/10.1177/17470161241235910</w:t>
+        <w:t>, S. E., &amp; Lockett, A. (2024). Reshaping consent so we might improve participant choice (III) – How is the research participant’s understanding currently checked and how might we improve this process?. Research Ethics. https://doi.org/10.1177/17470161241235910</w:t>
       </w:r>
     </w:p>
     <w:p>
@@ -22494,15 +21241,7 @@
         <w:spacing w:line="480" w:lineRule="auto"/>
       </w:pPr>
       <w:r>
-        <w:t xml:space="preserve">D'Mello, S., McCauley, L., &amp; Markham, J. (n.d.). A mechanism for human - robot interaction through informal voice commands. ROMAN 2005. IEEE International Workshop on Robot and Human Interactive Communication, </w:t>
-      </w:r>
-      <w:proofErr w:type="gramStart"/>
-      <w:r>
-        <w:t>2005..</w:t>
-      </w:r>
-      <w:proofErr w:type="gramEnd"/>
-      <w:r>
-        <w:t xml:space="preserve"> https://doi.org/10.1109/roman.2005.1513777</w:t>
+        <w:t>D'Mello, S., McCauley, L., &amp; Markham, J. (n.d.). A mechanism for human - robot interaction through informal voice commands. ROMAN 2005. IEEE International Workshop on Robot and Human Interactive Communication, 2005.. https://doi.org/10.1109/roman.2005.1513777</w:t>
       </w:r>
     </w:p>
     <w:p>
@@ -22601,15 +21340,7 @@
       </w:r>
       <w:proofErr w:type="spellEnd"/>
       <w:r>
-        <w:t xml:space="preserve">, C., &amp; Chen, J. (2025). Willingness to communicate </w:t>
-      </w:r>
-      <w:proofErr w:type="gramStart"/>
-      <w:r>
-        <w:t>and</w:t>
-      </w:r>
-      <w:proofErr w:type="gramEnd"/>
-      <w:r>
-        <w:t xml:space="preserve"> anxiety in human–human and human–chatbot interaction contexts: an </w:t>
+        <w:t xml:space="preserve">, C., &amp; Chen, J. (2025). Willingness to communicate and anxiety in human–human and human–chatbot interaction contexts: an </w:t>
       </w:r>
       <w:proofErr w:type="spellStart"/>
       <w:r>
@@ -22639,15 +21370,7 @@
       </w:r>
       <w:proofErr w:type="spellEnd"/>
       <w:r>
-        <w:t xml:space="preserve"> Group LLC (2024). Detecting Similar Complex Data Structures in Large-Scale Datasets. Current Research in Statistics &amp;</w:t>
-      </w:r>
-      <w:proofErr w:type="gramStart"/>
-      <w:r>
-        <w:t>amp</w:t>
-      </w:r>
-      <w:proofErr w:type="gramEnd"/>
-      <w:r>
-        <w:t>; Mathematics. https://doi.org/10.33140/crsm.03.02.03</w:t>
+        <w:t xml:space="preserve"> Group LLC (2024). Detecting Similar Complex Data Structures in Large-Scale Datasets. Current Research in Statistics &amp;amp; Mathematics. https://doi.org/10.33140/crsm.03.02.03</w:t>
       </w:r>
     </w:p>
     <w:p>
@@ -22687,23 +21410,7 @@
       </w:r>
       <w:proofErr w:type="spellEnd"/>
       <w:r>
-        <w:t xml:space="preserve">, P., &amp; Hart, D. (2024). Big Data Processing Platform for Large Acoustic Datasets and Complex Data Pipelines: Leveraging Cutting Edge </w:t>
-      </w:r>
-      <w:proofErr w:type="gramStart"/>
-      <w:r>
-        <w:t>Open Source</w:t>
-      </w:r>
-      <w:proofErr w:type="gramEnd"/>
-      <w:r>
-        <w:t xml:space="preserve"> Software to Build Scalable </w:t>
-      </w:r>
-      <w:proofErr w:type="gramStart"/>
-      <w:r>
-        <w:t>Cost Effective</w:t>
-      </w:r>
-      <w:proofErr w:type="gramEnd"/>
-      <w:r>
-        <w:t xml:space="preserve"> Solutions. OCEANS 2024 - Halifax. https://doi.org/10.1109/oceans55160.2024.10754471</w:t>
+        <w:t>, P., &amp; Hart, D. (2024). Big Data Processing Platform for Large Acoustic Datasets and Complex Data Pipelines: Leveraging Cutting Edge Open Source Software to Build Scalable Cost Effective Solutions. OCEANS 2024 - Halifax. https://doi.org/10.1109/oceans55160.2024.10754471</w:t>
       </w:r>
     </w:p>
     <w:p>
@@ -22739,31 +21446,7 @@
         <w:spacing w:line="480" w:lineRule="auto"/>
       </w:pPr>
       <w:r>
-        <w:t xml:space="preserve">Qin, X. (n.d.). Clustering And Classification </w:t>
-      </w:r>
-      <w:proofErr w:type="gramStart"/>
-      <w:r>
-        <w:t>Of</w:t>
-      </w:r>
-      <w:proofErr w:type="gramEnd"/>
-      <w:r>
-        <w:t xml:space="preserve"> Complex Datasets </w:t>
-      </w:r>
-      <w:proofErr w:type="gramStart"/>
-      <w:r>
-        <w:t>With</w:t>
-      </w:r>
-      <w:proofErr w:type="gramEnd"/>
-      <w:r>
-        <w:t xml:space="preserve"> Applications </w:t>
-      </w:r>
-      <w:proofErr w:type="gramStart"/>
-      <w:r>
-        <w:t>In</w:t>
-      </w:r>
-      <w:proofErr w:type="gramEnd"/>
-      <w:r>
-        <w:t xml:space="preserve"> Crime, Microbiome, And Raman Spectroscopy Data. Carleton University. https://doi.org/10.22215/etd/2025-16818</w:t>
+        <w:t>Qin, X. (n.d.). Clustering And Classification Of Complex Datasets With Applications In Crime, Microbiome, And Raman Spectroscopy Data. Carleton University. https://doi.org/10.22215/etd/2025-16818</w:t>
       </w:r>
     </w:p>
     <w:p>
@@ -22811,15 +21494,7 @@
       </w:r>
       <w:proofErr w:type="spellEnd"/>
       <w:r>
-        <w:t xml:space="preserve"> More Accurately Than Conventional Regulatory Assumptions in Funds Transfer Pricing </w:t>
-      </w:r>
-      <w:proofErr w:type="gramStart"/>
-      <w:r>
-        <w:t>Frameworks?.</w:t>
-      </w:r>
-      <w:proofErr w:type="gramEnd"/>
-      <w:r>
-        <w:t xml:space="preserve"> Elsevier BV. https://doi.org/10.2139/ssrn.7260700</w:t>
+        <w:t xml:space="preserve"> More Accurately Than Conventional Regulatory Assumptions in Funds Transfer Pricing Frameworks?. Elsevier BV. https://doi.org/10.2139/ssrn.7260700</w:t>
       </w:r>
     </w:p>
     <w:p>
@@ -22848,15 +21523,7 @@
       </w:r>
       <w:proofErr w:type="spellEnd"/>
       <w:r>
-        <w:t xml:space="preserve"> (n.d.). Table 9: The assumptions made by the TM </w:t>
-      </w:r>
-      <w:proofErr w:type="gramStart"/>
-      <w:r>
-        <w:t>models..</w:t>
-      </w:r>
-      <w:proofErr w:type="gramEnd"/>
-      <w:r>
-        <w:t xml:space="preserve"> </w:t>
+        <w:t xml:space="preserve"> (n.d.). Table 9: The assumptions made by the TM models.. </w:t>
       </w:r>
       <w:proofErr w:type="spellStart"/>
       <w:r>
@@ -22881,31 +21548,15 @@
         <w:spacing w:line="480" w:lineRule="auto"/>
       </w:pPr>
       <w:r>
-        <w:t xml:space="preserve">Li, C., &amp; Jiang, X. (2023). Unmasking Assumptions- Evaluating the Impact of Data Augmentation on Machine Learning Models in Healthcare Datasets (Preprint). JMIR Publications </w:t>
-      </w:r>
-      <w:proofErr w:type="gramStart"/>
-      <w:r>
-        <w:t>Inc..</w:t>
-      </w:r>
-      <w:proofErr w:type="gramEnd"/>
-      <w:r>
-        <w:t xml:space="preserve"> https://doi.org/10.2196/preprints.50042</w:t>
-      </w:r>
-    </w:p>
-    <w:p>
-      <w:pPr>
-        <w:spacing w:line="480" w:lineRule="auto"/>
-      </w:pPr>
-      <w:r>
-        <w:t xml:space="preserve">American Psychological Association (APA) (2020). Supplemental Material for Can the Stimulus Processing Assumptions of the Sometimes-Opponent-Process (SOP) Model Explain Instances of Contextual </w:t>
-      </w:r>
-      <w:proofErr w:type="gramStart"/>
-      <w:r>
-        <w:t>Learning?.</w:t>
-      </w:r>
-      <w:proofErr w:type="gramEnd"/>
-      <w:r>
-        <w:t xml:space="preserve"> Journal of Experimental Psychology: Animal Learning and Cognition. https://doi.org/10.1037/xan0000251.supp</w:t>
+        <w:t>Li, C., &amp; Jiang, X. (2023). Unmasking Assumptions- Evaluating the Impact of Data Augmentation on Machine Learning Models in Healthcare Datasets (Preprint). JMIR Publications Inc.. https://doi.org/10.2196/preprints.50042</w:t>
+      </w:r>
+    </w:p>
+    <w:p>
+      <w:pPr>
+        <w:spacing w:line="480" w:lineRule="auto"/>
+      </w:pPr>
+      <w:r>
+        <w:t>American Psychological Association (APA) (2020). Supplemental Material for Can the Stimulus Processing Assumptions of the Sometimes-Opponent-Process (SOP) Model Explain Instances of Contextual Learning?. Journal of Experimental Psychology: Animal Learning and Cognition. https://doi.org/10.1037/xan0000251.supp</w:t>
       </w:r>
     </w:p>
     <w:p>
@@ -22978,15 +21629,7 @@
         <w:spacing w:line="480" w:lineRule="auto"/>
       </w:pPr>
       <w:r>
-        <w:t xml:space="preserve">Boero, F. (2021). Faculty Opinions recommendation of Where might we find ecologically intact </w:t>
-      </w:r>
-      <w:proofErr w:type="gramStart"/>
-      <w:r>
-        <w:t>communities?.</w:t>
-      </w:r>
-      <w:proofErr w:type="gramEnd"/>
-      <w:r>
-        <w:t xml:space="preserve"> Faculty Opinions – Post-Publication Peer Review of the Biomedical Literature. https://doi.org/10.3410/f.739949900.793585058</w:t>
+        <w:t>Boero, F. (2021). Faculty Opinions recommendation of Where might we find ecologically intact communities?. Faculty Opinions – Post-Publication Peer Review of the Biomedical Literature. https://doi.org/10.3410/f.739949900.793585058</w:t>
       </w:r>
     </w:p>
     <w:p>
@@ -23026,23 +21669,7 @@
         <w:spacing w:line="480" w:lineRule="auto"/>
       </w:pPr>
       <w:r>
-        <w:t xml:space="preserve">Kubo, H., Bauder, J., &amp; Bauder, J. (2022). Who Might Have the Data I </w:t>
-      </w:r>
-      <w:proofErr w:type="gramStart"/>
-      <w:r>
-        <w:t>Want?.</w:t>
-      </w:r>
-      <w:proofErr w:type="gramEnd"/>
-      <w:r>
-        <w:t xml:space="preserve"> How Can You Find </w:t>
-      </w:r>
-      <w:proofErr w:type="gramStart"/>
-      <w:r>
-        <w:t>Data?.</w:t>
-      </w:r>
-      <w:proofErr w:type="gramEnd"/>
-      <w:r>
-        <w:t xml:space="preserve"> https://doi.org/10.4135/9781071904558</w:t>
+        <w:t>Kubo, H., Bauder, J., &amp; Bauder, J. (2022). Who Might Have the Data I Want?. How Can You Find Data?. https://doi.org/10.4135/9781071904558</w:t>
       </w:r>
     </w:p>
     <w:p>
@@ -23074,15 +21701,7 @@
         <w:spacing w:line="480" w:lineRule="auto"/>
       </w:pPr>
       <w:r>
-        <w:t xml:space="preserve">Zoro, R. (2026). Where can I find the lowest price on Starz? {{Get assistance from our support </w:t>
-      </w:r>
-      <w:proofErr w:type="gramStart"/>
-      <w:r>
-        <w:t>staff}}.</w:t>
-      </w:r>
-      <w:proofErr w:type="gramEnd"/>
-      <w:r>
-        <w:t xml:space="preserve"> </w:t>
+        <w:t xml:space="preserve">Zoro, R. (2026). Where can I find the lowest price on Starz? {{Get assistance from our support staff}}. </w:t>
       </w:r>
       <w:proofErr w:type="spellStart"/>
       <w:r>
@@ -23090,15 +21709,7 @@
       </w:r>
       <w:proofErr w:type="spellEnd"/>
       <w:r>
-        <w:t xml:space="preserve"> Technologies, </w:t>
-      </w:r>
-      <w:proofErr w:type="gramStart"/>
-      <w:r>
-        <w:t>Inc..</w:t>
-      </w:r>
-      <w:proofErr w:type="gramEnd"/>
-      <w:r>
-        <w:t xml:space="preserve"> https://doi.org/10.55277/researchhub.olvnzy2x</w:t>
+        <w:t xml:space="preserve"> Technologies, Inc.. https://doi.org/10.55277/researchhub.olvnzy2x</w:t>
       </w:r>
     </w:p>
     <w:p>
@@ -23107,23 +21718,7 @@
       </w:pPr>
       <w:r>
         <w:lastRenderedPageBreak/>
-        <w:t xml:space="preserve">SAGE Publications Ltd (2018). Money, money, money! Where can we find </w:t>
-      </w:r>
-      <w:proofErr w:type="gramStart"/>
-      <w:r>
-        <w:t>the financial</w:t>
-      </w:r>
-      <w:proofErr w:type="gramEnd"/>
-      <w:r>
-        <w:t xml:space="preserve"> support for our </w:t>
-      </w:r>
-      <w:proofErr w:type="gramStart"/>
-      <w:r>
-        <w:t>plans?.</w:t>
-      </w:r>
-      <w:proofErr w:type="gramEnd"/>
-      <w:r>
-        <w:t xml:space="preserve"> Local Regeneration Handbook. https://doi.org/10.4135/9781526428769.n11</w:t>
+        <w:t>SAGE Publications Ltd (2018). Money, money, money! Where can we find the financial support for our plans?. Local Regeneration Handbook. https://doi.org/10.4135/9781526428769.n11</w:t>
       </w:r>
     </w:p>
     <w:p>
@@ -23230,15 +21825,7 @@
         <w:spacing w:line="480" w:lineRule="auto"/>
       </w:pPr>
       <w:r>
-        <w:t xml:space="preserve">Lohan, K. S., Deshmukh, A., &amp; Aylett, R. (2014). How can a robot signal its incapability to perform a certain task to humans in an acceptable </w:t>
-      </w:r>
-      <w:proofErr w:type="gramStart"/>
-      <w:r>
-        <w:t>manner?.</w:t>
-      </w:r>
-      <w:proofErr w:type="gramEnd"/>
-      <w:r>
-        <w:t xml:space="preserve"> The 23rd IEEE International Symposium on Robot and Human Interactive Communication. https://doi.org/10.1109/roman.2014.6926353</w:t>
+        <w:t>Lohan, K. S., Deshmukh, A., &amp; Aylett, R. (2014). How can a robot signal its incapability to perform a certain task to humans in an acceptable manner?. The 23rd IEEE International Symposium on Robot and Human Interactive Communication. https://doi.org/10.1109/roman.2014.6926353</w:t>
       </w:r>
     </w:p>
     <w:p>
@@ -23280,15 +21867,7 @@
       </w:r>
       <w:proofErr w:type="spellEnd"/>
       <w:r>
-        <w:t xml:space="preserve">, S. A., &amp; Sumina, T. G. (2017). CAN vocational INSTITUTION TEACHER WITHOUT PEDAGOGICAL EDUCATION perform THE tasks of </w:t>
-      </w:r>
-      <w:proofErr w:type="gramStart"/>
-      <w:r>
-        <w:t>upbringing?.</w:t>
-      </w:r>
-      <w:proofErr w:type="gramEnd"/>
-      <w:r>
-        <w:t xml:space="preserve"> Pedagogical Education in Russia. https://doi.org/10.26170/po17-01-02</w:t>
+        <w:t>, S. A., &amp; Sumina, T. G. (2017). CAN vocational INSTITUTION TEACHER WITHOUT PEDAGOGICAL EDUCATION perform THE tasks of upbringing?. Pedagogical Education in Russia. https://doi.org/10.26170/po17-01-02</w:t>
       </w:r>
     </w:p>
     <w:p>
@@ -23305,15 +21884,7 @@
       </w:pPr>
       <w:r>
         <w:lastRenderedPageBreak/>
-        <w:t>Price, C. J., &amp; Friston, K. J. (1999). Scanning patients with tasks they can perform. Human Brain Mapping. https://doi.org/10.1002/(sici)1097-0193(1999)8:2/3&lt;</w:t>
-      </w:r>
-      <w:proofErr w:type="gramStart"/>
-      <w:r>
-        <w:t>102::</w:t>
-      </w:r>
-      <w:proofErr w:type="gramEnd"/>
-      <w:r>
-        <w:t>aid-hbm6&gt;3.0.co;2-j</w:t>
+        <w:t>Price, C. J., &amp; Friston, K. J. (1999). Scanning patients with tasks they can perform. Human Brain Mapping. https://doi.org/10.1002/(sici)1097-0193(1999)8:2/3&lt;102::aid-hbm6&gt;3.0.co;2-j</w:t>
       </w:r>
     </w:p>
     <w:p>
@@ -23350,15 +21921,7 @@
       </w:r>
       <w:proofErr w:type="spellEnd"/>
       <w:r>
-        <w:t>&gt; within the Results section) on the described hardware (see Table A1</w:t>
-      </w:r>
-      <w:proofErr w:type="gramStart"/>
-      <w:r>
-        <w:t>)..</w:t>
-      </w:r>
-      <w:proofErr w:type="gramEnd"/>
-      <w:r>
-        <w:t xml:space="preserve"> </w:t>
+        <w:t xml:space="preserve">&gt; within the Results section) on the described hardware (see Table A1).. </w:t>
       </w:r>
       <w:proofErr w:type="spellStart"/>
       <w:r>
@@ -23379,15 +21942,7 @@
       </w:r>
       <w:proofErr w:type="spellEnd"/>
       <w:r>
-        <w:t xml:space="preserve"> (n.d.). Table 6: Comparison table of without resampling approach for different machine learning </w:t>
-      </w:r>
-      <w:proofErr w:type="gramStart"/>
-      <w:r>
-        <w:t>classifier..</w:t>
-      </w:r>
-      <w:proofErr w:type="gramEnd"/>
-      <w:r>
-        <w:t xml:space="preserve"> </w:t>
+        <w:t xml:space="preserve"> (n.d.). Table 6: Comparison table of without resampling approach for different machine learning classifier.. </w:t>
       </w:r>
       <w:proofErr w:type="spellStart"/>
       <w:r>
@@ -23416,15 +21971,7 @@
       </w:r>
       <w:proofErr w:type="spellEnd"/>
       <w:r>
-        <w:t xml:space="preserve"> Agent can perform to navigate in the graphical representation of the table in multiple </w:t>
-      </w:r>
-      <w:proofErr w:type="gramStart"/>
-      <w:r>
-        <w:t>iterations..</w:t>
-      </w:r>
-      <w:proofErr w:type="gramEnd"/>
-      <w:r>
-        <w:t xml:space="preserve"> </w:t>
+        <w:t xml:space="preserve"> Agent can perform to navigate in the graphical representation of the table in multiple iterations.. </w:t>
       </w:r>
       <w:proofErr w:type="spellStart"/>
       <w:r>
@@ -23445,15 +21992,7 @@
       </w:r>
       <w:proofErr w:type="spellEnd"/>
       <w:r>
-        <w:t xml:space="preserve"> (n.d.). Table 1: Mean execution times for pipelines and tasks with and without </w:t>
-      </w:r>
-      <w:proofErr w:type="gramStart"/>
-      <w:r>
-        <w:t>Docker..</w:t>
-      </w:r>
-      <w:proofErr w:type="gramEnd"/>
-      <w:r>
-        <w:t xml:space="preserve"> </w:t>
+        <w:t xml:space="preserve"> (n.d.). Table 1: Mean execution times for pipelines and tasks with and without Docker.. </w:t>
       </w:r>
       <w:proofErr w:type="spellStart"/>
       <w:r>
@@ -23482,23 +22021,7 @@
       </w:r>
       <w:proofErr w:type="spellEnd"/>
       <w:r>
-        <w:t xml:space="preserve"> Sciences </w:t>
-      </w:r>
-      <w:proofErr w:type="gramStart"/>
-      <w:r>
-        <w:t>Publications,</w:t>
-      </w:r>
-      <w:proofErr w:type="gramEnd"/>
-      <w:r>
-        <w:t xml:space="preserve"> Ltd (n.d.). Table 4. V1/2’ values for each neuron described in Table </w:t>
-      </w:r>
-      <w:proofErr w:type="gramStart"/>
-      <w:r>
-        <w:t>4..</w:t>
-      </w:r>
-      <w:proofErr w:type="gramEnd"/>
-      <w:r>
-        <w:t xml:space="preserve"> </w:t>
+        <w:t xml:space="preserve"> Sciences Publications, Ltd (n.d.). Table 4. V1/2’ values for each neuron described in Table 4.. </w:t>
       </w:r>
       <w:proofErr w:type="spellStart"/>
       <w:r>
@@ -23528,15 +22051,7 @@
       </w:r>
       <w:proofErr w:type="spellEnd"/>
       <w:r>
-        <w:t xml:space="preserve"> Sciences </w:t>
-      </w:r>
-      <w:proofErr w:type="gramStart"/>
-      <w:r>
-        <w:t>Publications,</w:t>
-      </w:r>
-      <w:proofErr w:type="gramEnd"/>
-      <w:r>
-        <w:t xml:space="preserve"> Ltd (n.d.). Table 1. The peak </w:t>
+        <w:t xml:space="preserve"> Sciences Publications, Ltd (n.d.). Table 1. The peak </w:t>
       </w:r>
       <w:proofErr w:type="spellStart"/>
       <w:r>
@@ -23544,15 +22059,7 @@
       </w:r>
       <w:proofErr w:type="spellEnd"/>
       <w:r>
-        <w:t xml:space="preserve"> amplitude for each neuron described in Table </w:t>
-      </w:r>
-      <w:proofErr w:type="gramStart"/>
-      <w:r>
-        <w:t>1..</w:t>
-      </w:r>
-      <w:proofErr w:type="gramEnd"/>
-      <w:r>
-        <w:t xml:space="preserve"> </w:t>
+        <w:t xml:space="preserve"> amplitude for each neuron described in Table 1.. </w:t>
       </w:r>
       <w:proofErr w:type="spellStart"/>
       <w:r>
@@ -23573,15 +22080,7 @@
       </w:r>
       <w:proofErr w:type="spellEnd"/>
       <w:r>
-        <w:t xml:space="preserve"> (n.d.). Table 6: Experimental results of machine learning model without feature </w:t>
-      </w:r>
-      <w:proofErr w:type="gramStart"/>
-      <w:r>
-        <w:t>selection..</w:t>
-      </w:r>
-      <w:proofErr w:type="gramEnd"/>
-      <w:r>
-        <w:t xml:space="preserve"> </w:t>
+        <w:t xml:space="preserve"> (n.d.). Table 6: Experimental results of machine learning model without feature selection.. </w:t>
       </w:r>
       <w:proofErr w:type="spellStart"/>
       <w:r>
@@ -23602,15 +22101,7 @@
       </w:r>
       <w:proofErr w:type="spellEnd"/>
       <w:r>
-        <w:t xml:space="preserve"> Sciences </w:t>
-      </w:r>
-      <w:proofErr w:type="gramStart"/>
-      <w:r>
-        <w:t>Publications,</w:t>
-      </w:r>
-      <w:proofErr w:type="gramEnd"/>
-      <w:r>
-        <w:t xml:space="preserve"> Ltd (n.d.). Table 3. Parameters characterizing </w:t>
+        <w:t xml:space="preserve"> Sciences Publications, Ltd (n.d.). Table 3. Parameters characterizing </w:t>
       </w:r>
       <w:proofErr w:type="spellStart"/>
       <w:r>
@@ -23618,15 +22109,7 @@
       </w:r>
       <w:proofErr w:type="spellEnd"/>
       <w:r>
-        <w:t xml:space="preserve"> activation for each neuron described in Table </w:t>
-      </w:r>
-      <w:proofErr w:type="gramStart"/>
-      <w:r>
-        <w:t>3..</w:t>
-      </w:r>
-      <w:proofErr w:type="gramEnd"/>
-      <w:r>
-        <w:t xml:space="preserve"> </w:t>
+        <w:t xml:space="preserve"> activation for each neuron described in Table 3.. </w:t>
       </w:r>
       <w:proofErr w:type="spellStart"/>
       <w:r>
@@ -23647,15 +22130,7 @@
       </w:r>
       <w:proofErr w:type="spellEnd"/>
       <w:r>
-        <w:t xml:space="preserve"> (n.d.). Table 3: Score value of alternatives using the comparison matrix described in Table </w:t>
-      </w:r>
-      <w:proofErr w:type="gramStart"/>
-      <w:r>
-        <w:t>2..</w:t>
-      </w:r>
-      <w:proofErr w:type="gramEnd"/>
-      <w:r>
-        <w:t xml:space="preserve"> </w:t>
+        <w:t xml:space="preserve"> (n.d.). Table 3: Score value of alternatives using the comparison matrix described in Table 2.. </w:t>
       </w:r>
       <w:proofErr w:type="spellStart"/>
       <w:r>
@@ -23676,15 +22151,7 @@
       </w:r>
       <w:proofErr w:type="spellEnd"/>
       <w:r>
-        <w:t xml:space="preserve"> (n.d.). Table 5: The experimental results in details of various configurations described in Table </w:t>
-      </w:r>
-      <w:proofErr w:type="gramStart"/>
-      <w:r>
-        <w:t>2..</w:t>
-      </w:r>
-      <w:proofErr w:type="gramEnd"/>
-      <w:r>
-        <w:t xml:space="preserve"> </w:t>
+        <w:t xml:space="preserve"> (n.d.). Table 5: The experimental results in details of various configurations described in Table 2.. </w:t>
       </w:r>
       <w:proofErr w:type="spellStart"/>
       <w:r>
@@ -23913,15 +22380,7 @@
       </w:pPr>
       <w:r>
         <w:lastRenderedPageBreak/>
-        <w:t xml:space="preserve">MUNIRETHINAM, D., &amp; P, D. (2026). Ai-powered Chess Analysis System for Skill Development: a Case Study Aligned with the Sustainable Development Goals. International Journal </w:t>
-      </w:r>
-      <w:proofErr w:type="gramStart"/>
-      <w:r>
-        <w:t>For</w:t>
-      </w:r>
-      <w:proofErr w:type="gramEnd"/>
-      <w:r>
-        <w:t xml:space="preserve"> Multidisciplinary Research. https://doi.org/10.36948/ijfmr.2026.v08i05.89550</w:t>
+        <w:t>MUNIRETHINAM, D., &amp; P, D. (2026). Ai-powered Chess Analysis System for Skill Development: a Case Study Aligned with the Sustainable Development Goals. International Journal For Multidisciplinary Research. https://doi.org/10.36948/ijfmr.2026.v08i05.89550</w:t>
       </w:r>
     </w:p>
     <w:p>
@@ -23937,15 +22396,7 @@
         <w:spacing w:line="480" w:lineRule="auto"/>
       </w:pPr>
       <w:r>
-        <w:t xml:space="preserve">Watson, N., Amer, A., Harris, E., Ravindra, P., &amp; Zhang, S. (2025). Personalized </w:t>
-      </w:r>
-      <w:proofErr w:type="gramStart"/>
-      <w:r>
-        <w:t>Constitutionally-Aligned</w:t>
-      </w:r>
-      <w:proofErr w:type="gramEnd"/>
-      <w:r>
-        <w:t xml:space="preserve"> Agentic Superego: Secure AI Behavior Aligned to Diverse Human Values. Information. https://doi.org/10.3390/info16080651</w:t>
+        <w:t>Watson, N., Amer, A., Harris, E., Ravindra, P., &amp; Zhang, S. (2025). Personalized Constitutionally-Aligned Agentic Superego: Secure AI Behavior Aligned to Diverse Human Values. Information. https://doi.org/10.3390/info16080651</w:t>
       </w:r>
     </w:p>
     <w:p>
@@ -23998,15 +22449,7 @@
         <w:spacing w:line="480" w:lineRule="auto"/>
       </w:pPr>
       <w:r>
-        <w:t xml:space="preserve">IIJIMA, K. (1999). Information delivery in the digital age. 10. Introduction to factual databases. 2. Factual databases in the material science </w:t>
-      </w:r>
-      <w:proofErr w:type="gramStart"/>
-      <w:r>
-        <w:t>fields..</w:t>
-      </w:r>
-      <w:proofErr w:type="gramEnd"/>
-      <w:r>
-        <w:t xml:space="preserve"> Journal of Information Processing and Management. https://doi.org/10.1241/johokanri.41.834</w:t>
+        <w:t>IIJIMA, K. (1999). Information delivery in the digital age. 10. Introduction to factual databases. 2. Factual databases in the material science fields.. Journal of Information Processing and Management. https://doi.org/10.1241/johokanri.41.834</w:t>
       </w:r>
     </w:p>
     <w:p>
@@ -24028,15 +22471,7 @@
       </w:r>
       <w:proofErr w:type="spellEnd"/>
       <w:r>
-        <w:t xml:space="preserve">, M. (2022). We look within... </w:t>
-      </w:r>
-      <w:proofErr w:type="gramStart"/>
-      <w:r>
-        <w:t>So</w:t>
-      </w:r>
-      <w:proofErr w:type="gramEnd"/>
-      <w:r>
-        <w:t xml:space="preserve"> we can look up - towards a nonviolent ethics of human brand co-creation. Research Handbook on Brand Co-Creation. https://doi.org/10.4337/9781839105425.00029</w:t>
+        <w:t>, M. (2022). We look within... So we can look up - towards a nonviolent ethics of human brand co-creation. Research Handbook on Brand Co-Creation. https://doi.org/10.4337/9781839105425.00029</w:t>
       </w:r>
     </w:p>
     <w:p>
@@ -24052,15 +22487,7 @@
         <w:spacing w:line="480" w:lineRule="auto"/>
       </w:pPr>
       <w:r>
-        <w:t xml:space="preserve">Lawson, A. J., &amp; Jochum, C. J. (1998). </w:t>
-      </w:r>
-      <w:proofErr w:type="gramStart"/>
-      <w:r>
-        <w:t>Factual Information</w:t>
-      </w:r>
-      <w:proofErr w:type="gramEnd"/>
-      <w:r>
-        <w:t xml:space="preserve"> Databases. Encyclopedia of Computational Chemistry. https://doi.org/10.1002/0470845015.cfa000m</w:t>
+        <w:t>Lawson, A. J., &amp; Jochum, C. J. (1998). Factual Information Databases. Encyclopedia of Computational Chemistry. https://doi.org/10.1002/0470845015.cfa000m</w:t>
       </w:r>
     </w:p>
     <w:p>
@@ -24076,15 +22503,7 @@
         <w:spacing w:line="480" w:lineRule="auto"/>
       </w:pPr>
       <w:r>
-        <w:t xml:space="preserve">Lampkin, C. (2021). Honest, </w:t>
-      </w:r>
-      <w:proofErr w:type="gramStart"/>
-      <w:r>
-        <w:t>Factual Information</w:t>
-      </w:r>
-      <w:proofErr w:type="gramEnd"/>
-      <w:r>
-        <w:t xml:space="preserve"> Is Key: A Look at How Older Adults View Vaccinations: Fact Sheet. AARP Research. https://doi.org/10.26419/res.00432.003</w:t>
+        <w:t>Lampkin, C. (2021). Honest, Factual Information Is Key: A Look at How Older Adults View Vaccinations: Fact Sheet. AARP Research. https://doi.org/10.26419/res.00432.003</w:t>
       </w:r>
     </w:p>
     <w:p>
@@ -24100,15 +22519,7 @@
         <w:spacing w:line="480" w:lineRule="auto"/>
       </w:pPr>
       <w:r>
-        <w:t xml:space="preserve">Nimmer, R. T. (2013). Issues in modern licensing of </w:t>
-      </w:r>
-      <w:proofErr w:type="gramStart"/>
-      <w:r>
-        <w:t>factual information</w:t>
-      </w:r>
-      <w:proofErr w:type="gramEnd"/>
-      <w:r>
-        <w:t xml:space="preserve"> and databases. Research Handbook on Intellectual Property Licensing. https://doi.org/10.4337/9781781005989.00012</w:t>
+        <w:t>Nimmer, R. T. (2013). Issues in modern licensing of factual information and databases. Research Handbook on Intellectual Property Licensing. https://doi.org/10.4337/9781781005989.00012</w:t>
       </w:r>
     </w:p>
     <w:p>
@@ -24188,15 +22599,7 @@
       </w:r>
       <w:proofErr w:type="spellEnd"/>
       <w:r>
-        <w:t xml:space="preserve"> (n.d.). Supplemental Information 6: Distribution of differences in transitivity T when non-informative prior </w:t>
-      </w:r>
-      <w:proofErr w:type="gramStart"/>
-      <w:r>
-        <w:t>were</w:t>
-      </w:r>
-      <w:proofErr w:type="gramEnd"/>
-      <w:r>
-        <w:t xml:space="preserve"> used. All distributions of differences were completely within ROPE. </w:t>
+        <w:t xml:space="preserve"> (n.d.). Supplemental Information 6: Distribution of differences in transitivity T when non-informative prior were used. All distributions of differences were completely within ROPE. </w:t>
       </w:r>
       <w:proofErr w:type="spellStart"/>
       <w:r>
@@ -24217,15 +22620,7 @@
       </w:r>
       <w:proofErr w:type="spellEnd"/>
       <w:r>
-        <w:t xml:space="preserve"> (n.d.). Supplemental Information 10: Distribution of differences in global efficiency E when non-informative prior </w:t>
-      </w:r>
-      <w:proofErr w:type="gramStart"/>
-      <w:r>
-        <w:t>were</w:t>
-      </w:r>
-      <w:proofErr w:type="gramEnd"/>
-      <w:r>
-        <w:t xml:space="preserve"> used. All distributions of differences were completely within ROPE. </w:t>
+        <w:t xml:space="preserve"> (n.d.). Supplemental Information 10: Distribution of differences in global efficiency E when non-informative prior were used. All distributions of differences were completely within ROPE. </w:t>
       </w:r>
       <w:proofErr w:type="spellStart"/>
       <w:r>
@@ -24364,23 +22759,7 @@
       </w:r>
       <w:proofErr w:type="spellEnd"/>
       <w:r>
-        <w:t xml:space="preserve"> (n.d.). Table 1: Details about the data corpora employed, including counts of session, talk turn, and word token, </w:t>
-      </w:r>
-      <w:proofErr w:type="gramStart"/>
-      <w:r>
-        <w:t>and also</w:t>
-      </w:r>
-      <w:proofErr w:type="gramEnd"/>
-      <w:r>
-        <w:t xml:space="preserve"> total time </w:t>
-      </w:r>
-      <w:proofErr w:type="gramStart"/>
-      <w:r>
-        <w:t>duration..</w:t>
-      </w:r>
-      <w:proofErr w:type="gramEnd"/>
-      <w:r>
-        <w:t xml:space="preserve"> </w:t>
+        <w:t xml:space="preserve"> (n.d.). Table 1: Details about the data corpora employed, including counts of session, talk turn, and word token, and also total time duration.. </w:t>
       </w:r>
       <w:proofErr w:type="spellStart"/>
       <w:r>
@@ -24473,15 +22852,7 @@
       </w:r>
       <w:proofErr w:type="spellEnd"/>
       <w:r>
-        <w:t xml:space="preserve"> (n.d.). Table 4: Word lists similarity matrix (BERT CLS token embedding</w:t>
-      </w:r>
-      <w:proofErr w:type="gramStart"/>
-      <w:r>
-        <w:t>)..</w:t>
-      </w:r>
-      <w:proofErr w:type="gramEnd"/>
-      <w:r>
-        <w:t xml:space="preserve"> </w:t>
+        <w:t xml:space="preserve"> (n.d.). Table 4: Word lists similarity matrix (BERT CLS token embedding).. </w:t>
       </w:r>
       <w:proofErr w:type="spellStart"/>
       <w:r>
@@ -24580,23 +22951,7 @@
       </w:r>
       <w:proofErr w:type="spellEnd"/>
       <w:r>
-        <w:t xml:space="preserve"> Sciences </w:t>
-      </w:r>
-      <w:proofErr w:type="gramStart"/>
-      <w:r>
-        <w:t>Publications,</w:t>
-      </w:r>
-      <w:proofErr w:type="gramEnd"/>
-      <w:r>
-        <w:t xml:space="preserve"> Ltd (n.d.). Figure 1—source data 1. Chinese stimuli together with their English translations, as well as some measures for the context up until the sentence final word (SFW), the word before the sentence final word (SFW-1) and the sentence final words (SFW</w:t>
-      </w:r>
-      <w:proofErr w:type="gramStart"/>
-      <w:r>
-        <w:t>)..</w:t>
-      </w:r>
-      <w:proofErr w:type="gramEnd"/>
-      <w:r>
-        <w:t xml:space="preserve"> </w:t>
+        <w:t xml:space="preserve"> Sciences Publications, Ltd (n.d.). Figure 1—source data 1. Chinese stimuli together with their English translations, as well as some measures for the context up until the sentence final word (SFW), the word before the sentence final word (SFW-1) and the sentence final words (SFW).. </w:t>
       </w:r>
       <w:proofErr w:type="spellStart"/>
       <w:r>
@@ -24669,15 +23024,7 @@
         <w:spacing w:line="480" w:lineRule="auto"/>
       </w:pPr>
       <w:r>
-        <w:t xml:space="preserve">State University of New York Press (2022). </w:t>
-      </w:r>
-      <w:proofErr w:type="gramStart"/>
-      <w:r>
-        <w:t>Introduction:.</w:t>
-      </w:r>
-      <w:proofErr w:type="gramEnd"/>
-      <w:r>
-        <w:t xml:space="preserve"> The Emergence of Word-Meaning in Early China. https://doi.org/10.2307/jj.18253342.4</w:t>
+        <w:t>State University of New York Press (2022). Introduction:. The Emergence of Word-Meaning in Early China. https://doi.org/10.2307/jj.18253342.4</w:t>
       </w:r>
     </w:p>
     <w:p>
@@ -24755,15 +23102,7 @@
         <w:spacing w:line="480" w:lineRule="auto"/>
       </w:pPr>
       <w:r>
-        <w:t xml:space="preserve">Rowman &amp; Littlefield (2014). Composing Multimodal Texts Through Use </w:t>
-      </w:r>
-      <w:proofErr w:type="gramStart"/>
-      <w:r>
-        <w:t>Of</w:t>
-      </w:r>
-      <w:proofErr w:type="gramEnd"/>
-      <w:r>
-        <w:t xml:space="preserve"> Images, Audio, And Video. Understanding and Creating Digital Texts. https://doi.org/10.5040/9798216529163.ch08</w:t>
+        <w:t>Rowman &amp; Littlefield (2014). Composing Multimodal Texts Through Use Of Images, Audio, And Video. Understanding and Creating Digital Texts. https://doi.org/10.5040/9798216529163.ch08</w:t>
       </w:r>
     </w:p>
     <w:p>
@@ -24787,15 +23126,7 @@
         <w:spacing w:line="480" w:lineRule="auto"/>
       </w:pPr>
       <w:r>
-        <w:t xml:space="preserve">Liu Huayong (n.d.). Content-Based </w:t>
-      </w:r>
-      <w:proofErr w:type="gramStart"/>
-      <w:r>
-        <w:t>TV Sports</w:t>
-      </w:r>
-      <w:proofErr w:type="gramEnd"/>
-      <w:r>
-        <w:t xml:space="preserve"> Video Retrieval Based on Audio-Visual Features and Text Information. IEEE/WIC/ACM International Conference on Web Intelligence (WI'04). https://doi.org/10.1109/wi.2004.10107</w:t>
+        <w:t>Liu Huayong (n.d.). Content-Based TV Sports Video Retrieval Based on Audio-Visual Features and Text Information. IEEE/WIC/ACM International Conference on Web Intelligence (WI'04). https://doi.org/10.1109/wi.2004.10107</w:t>
       </w:r>
     </w:p>
     <w:p>
@@ -24859,15 +23190,7 @@
       </w:r>
       <w:proofErr w:type="spellEnd"/>
       <w:r>
-        <w:t xml:space="preserve"> (n.d.). Table 4: Transferred learning from pre-trained model to contrast-enhanced CT </w:t>
-      </w:r>
-      <w:proofErr w:type="gramStart"/>
-      <w:r>
-        <w:t>dataset..</w:t>
-      </w:r>
-      <w:proofErr w:type="gramEnd"/>
-      <w:r>
-        <w:t xml:space="preserve"> </w:t>
+        <w:t xml:space="preserve"> (n.d.). Table 4: Transferred learning from pre-trained model to contrast-enhanced CT dataset.. </w:t>
       </w:r>
       <w:proofErr w:type="spellStart"/>
       <w:r>
@@ -24888,15 +23211,7 @@
       </w:r>
       <w:proofErr w:type="spellEnd"/>
       <w:r>
-        <w:t xml:space="preserve"> (n.d.). Table 2: Selected pre-trained parameters for generalized normal distribution optimization model </w:t>
-      </w:r>
-      <w:proofErr w:type="gramStart"/>
-      <w:r>
-        <w:t>training..</w:t>
-      </w:r>
-      <w:proofErr w:type="gramEnd"/>
-      <w:r>
-        <w:t xml:space="preserve"> </w:t>
+        <w:t xml:space="preserve"> (n.d.). Table 2: Selected pre-trained parameters for generalized normal distribution optimization model training.. </w:t>
       </w:r>
       <w:proofErr w:type="spellStart"/>
       <w:r>
@@ -24925,15 +23240,7 @@
       </w:r>
       <w:proofErr w:type="spellEnd"/>
       <w:r>
-        <w:t xml:space="preserve"> dataset using “paraphrase-distilrobertabase-v1” Pre-trained BERT </w:t>
-      </w:r>
-      <w:proofErr w:type="gramStart"/>
-      <w:r>
-        <w:t>model..</w:t>
-      </w:r>
-      <w:proofErr w:type="gramEnd"/>
-      <w:r>
-        <w:t xml:space="preserve"> </w:t>
+        <w:t xml:space="preserve"> dataset using “paraphrase-distilrobertabase-v1” Pre-trained BERT model.. </w:t>
       </w:r>
       <w:proofErr w:type="spellStart"/>
       <w:r>
@@ -24994,15 +23301,7 @@
       </w:r>
       <w:proofErr w:type="spellEnd"/>
       <w:r>
-        <w:t xml:space="preserve">-mean-tokens” pre-trained BERT </w:t>
-      </w:r>
-      <w:proofErr w:type="gramStart"/>
-      <w:r>
-        <w:t>model..</w:t>
-      </w:r>
-      <w:proofErr w:type="gramEnd"/>
-      <w:r>
-        <w:t xml:space="preserve"> </w:t>
+        <w:t xml:space="preserve">-mean-tokens” pre-trained BERT model.. </w:t>
       </w:r>
       <w:proofErr w:type="spellStart"/>
       <w:r>
@@ -25039,15 +23338,7 @@
       </w:r>
       <w:proofErr w:type="spellEnd"/>
       <w:r>
-        <w:t xml:space="preserve">-mean-tokens” Pre-trained BERT </w:t>
-      </w:r>
-      <w:proofErr w:type="gramStart"/>
-      <w:r>
-        <w:t>model..</w:t>
-      </w:r>
-      <w:proofErr w:type="gramEnd"/>
-      <w:r>
-        <w:t xml:space="preserve"> </w:t>
+        <w:t xml:space="preserve">-mean-tokens” Pre-trained BERT model.. </w:t>
       </w:r>
       <w:proofErr w:type="spellStart"/>
       <w:r>
@@ -25069,15 +23360,7 @@
       </w:r>
       <w:proofErr w:type="spellEnd"/>
       <w:r>
-        <w:t xml:space="preserve"> (n.d.). Table 6: Performance results on the AG News dataset using “paraphrase-distilroberta-base-v1” Pre-trained BERT </w:t>
-      </w:r>
-      <w:proofErr w:type="gramStart"/>
-      <w:r>
-        <w:t>model..</w:t>
-      </w:r>
-      <w:proofErr w:type="gramEnd"/>
-      <w:r>
-        <w:t xml:space="preserve"> </w:t>
+        <w:t xml:space="preserve"> (n.d.). Table 6: Performance results on the AG News dataset using “paraphrase-distilroberta-base-v1” Pre-trained BERT model.. </w:t>
       </w:r>
       <w:proofErr w:type="spellStart"/>
       <w:r>
@@ -25098,15 +23381,7 @@
       </w:r>
       <w:proofErr w:type="spellEnd"/>
       <w:r>
-        <w:t xml:space="preserve"> (n.d.). Figure 2: Illustration of knowledge distillation using (A) pre-trained teacher model (offline) and (B) while training the teacher model simultaneously (online</w:t>
-      </w:r>
-      <w:proofErr w:type="gramStart"/>
-      <w:r>
-        <w:t>)..</w:t>
-      </w:r>
-      <w:proofErr w:type="gramEnd"/>
-      <w:r>
-        <w:t xml:space="preserve"> </w:t>
+        <w:t xml:space="preserve"> (n.d.). Figure 2: Illustration of knowledge distillation using (A) pre-trained teacher model (offline) and (B) while training the teacher model simultaneously (online).. </w:t>
       </w:r>
       <w:proofErr w:type="spellStart"/>
       <w:r>
@@ -25154,17 +23429,12 @@
         <w:t xml:space="preserve"> (n.d.). Figure 2: Overview of pre-training, further pre-training, classification, and fine-tuning of </w:t>
       </w:r>
       <w:proofErr w:type="spellStart"/>
-      <w:proofErr w:type="gramStart"/>
       <w:r>
         <w:t>FinBERT</w:t>
       </w:r>
       <w:proofErr w:type="spellEnd"/>
       <w:r>
-        <w:t>..</w:t>
-      </w:r>
-      <w:proofErr w:type="gramEnd"/>
-      <w:r>
-        <w:t xml:space="preserve"> </w:t>
+        <w:t xml:space="preserve">.. </w:t>
       </w:r>
       <w:proofErr w:type="spellStart"/>
       <w:r>
@@ -25185,15 +23455,7 @@
       </w:r>
       <w:proofErr w:type="spellEnd"/>
       <w:r>
-        <w:t xml:space="preserve"> (n.d.). Table 7: Second experiment, trained on the imbalanced training </w:t>
-      </w:r>
-      <w:proofErr w:type="gramStart"/>
-      <w:r>
-        <w:t>dataset..</w:t>
-      </w:r>
-      <w:proofErr w:type="gramEnd"/>
-      <w:r>
-        <w:t xml:space="preserve"> </w:t>
+        <w:t xml:space="preserve"> (n.d.). Table 7: Second experiment, trained on the imbalanced training dataset.. </w:t>
       </w:r>
       <w:proofErr w:type="spellStart"/>
       <w:r>
@@ -25304,23 +23566,7 @@
       </w:pPr>
       <w:r>
         <w:lastRenderedPageBreak/>
-        <w:t xml:space="preserve">Health Affairs Publishing, LLC (2016). EEOC Rules Allow Significant Rewards, Penalties </w:t>
-      </w:r>
-      <w:proofErr w:type="gramStart"/>
-      <w:r>
-        <w:t>In</w:t>
-      </w:r>
-      <w:proofErr w:type="gramEnd"/>
-      <w:r>
-        <w:t xml:space="preserve"> Connection </w:t>
-      </w:r>
-      <w:proofErr w:type="gramStart"/>
-      <w:r>
-        <w:t>With</w:t>
-      </w:r>
-      <w:proofErr w:type="gramEnd"/>
-      <w:r>
-        <w:t xml:space="preserve"> Wellness Program Participation (Update). Forefront Group. https://doi.org/10.1377/forefront.20160517.054902</w:t>
+        <w:t>Health Affairs Publishing, LLC (2016). EEOC Rules Allow Significant Rewards, Penalties In Connection With Wellness Program Participation (Update). Forefront Group. https://doi.org/10.1377/forefront.20160517.054902</w:t>
       </w:r>
     </w:p>
     <w:p>
@@ -28127,19 +26373,19 @@
 
 <file path=word/glossary/fontTable.xml><?xml version="1.0" encoding="utf-8"?>
 <w:fonts xmlns:mc="http://schemas.openxmlformats.org/markup-compatibility/2006" xmlns:r="http://schemas.openxmlformats.org/officeDocument/2006/relationships" xmlns:w="http://schemas.openxmlformats.org/wordprocessingml/2006/main" xmlns:w14="http://schemas.microsoft.com/office/word/2010/wordml" xmlns:w15="http://schemas.microsoft.com/office/word/2012/wordml" xmlns:w16cex="http://schemas.microsoft.com/office/word/2018/wordml/cex" xmlns:w16cid="http://schemas.microsoft.com/office/word/2016/wordml/cid" xmlns:w16="http://schemas.microsoft.com/office/word/2018/wordml" xmlns:w16du="http://schemas.microsoft.com/office/word/2023/wordml/word16du" xmlns:w16sdtdh="http://schemas.microsoft.com/office/word/2020/wordml/sdtdatahash" xmlns:w16sdtfl="http://schemas.microsoft.com/office/word/2024/wordml/sdtformatlock" xmlns:w16se="http://schemas.microsoft.com/office/word/2015/wordml/symex" mc:Ignorable="w14 w15 w16se w16cid w16 w16cex w16sdtdh w16sdtfl w16du">
+  <w:font w:name="Science Gothic Medium">
+    <w:panose1 w:val="00000000000000000000"/>
+    <w:charset w:val="00"/>
+    <w:family w:val="auto"/>
+    <w:pitch w:val="variable"/>
+    <w:sig w:usb0="A000026F" w:usb1="00002003" w:usb2="00000020" w:usb3="00000000" w:csb0="00000197" w:csb1="00000000"/>
+  </w:font>
   <w:font w:name="Times New Roman">
     <w:panose1 w:val="02020603050405020304"/>
     <w:charset w:val="00"/>
     <w:family w:val="roman"/>
     <w:pitch w:val="variable"/>
     <w:sig w:usb0="E0002EFF" w:usb1="C000785B" w:usb2="00000009" w:usb3="00000000" w:csb0="000001FF" w:csb1="00000000"/>
-  </w:font>
-  <w:font w:name="Science Gothic Medium">
-    <w:panose1 w:val="00000000000000000000"/>
-    <w:charset w:val="00"/>
-    <w:family w:val="auto"/>
-    <w:pitch w:val="variable"/>
-    <w:sig w:usb0="A000026F" w:usb1="00002003" w:usb2="00000020" w:usb3="00000000" w:csb0="00000197" w:csb1="00000000"/>
   </w:font>
   <w:font w:name="Courier New">
     <w:panose1 w:val="02070309020205020404"/>
@@ -28265,12 +26511,14 @@
     <w:rsidRoot w:val="00611CF5"/>
     <w:rsid w:val="0000611D"/>
     <w:rsid w:val="00143885"/>
+    <w:rsid w:val="001E1F57"/>
     <w:rsid w:val="0031319E"/>
     <w:rsid w:val="00333935"/>
     <w:rsid w:val="004F774A"/>
     <w:rsid w:val="00580ED5"/>
     <w:rsid w:val="00611CF5"/>
     <w:rsid w:val="00620BB9"/>
+    <w:rsid w:val="00627E49"/>
     <w:rsid w:val="006B4384"/>
     <w:rsid w:val="008E3F1D"/>
     <w:rsid w:val="009A52D2"/>
@@ -29228,30 +27476,15 @@
 </file>
 
 <file path=customXml/item1.xml><?xml version="1.0" encoding="utf-8"?>
-<p:properties xmlns:p="http://schemas.microsoft.com/office/2006/metadata/properties" xmlns:xsi="http://www.w3.org/2001/XMLSchema-instance" xmlns:pc="http://schemas.microsoft.com/office/infopath/2007/PartnerControls">
-  <documentManagement>
-    <_ip_UnifiedCompliancePolicyUIAction xmlns="http://schemas.microsoft.com/sharepoint/v3" xsi:nil="true"/>
-    <Image xmlns="71af3243-3dd4-4a8d-8c0d-dd76da1f02a5">
-      <Url xsi:nil="true"/>
-      <Description xsi:nil="true"/>
-    </Image>
-    <Status xmlns="71af3243-3dd4-4a8d-8c0d-dd76da1f02a5">Not started</Status>
-    <Background xmlns="71af3243-3dd4-4a8d-8c0d-dd76da1f02a5">false</Background>
-    <_ip_UnifiedCompliancePolicyProperties xmlns="http://schemas.microsoft.com/sharepoint/v3" xsi:nil="true"/>
-    <ImageTagsTaxHTField xmlns="71af3243-3dd4-4a8d-8c0d-dd76da1f02a5">
-      <Terms xmlns="http://schemas.microsoft.com/office/infopath/2007/PartnerControls"/>
-    </ImageTagsTaxHTField>
-    <TaxCatchAll xmlns="230e9df3-be65-4c73-a93b-d1236ebd677e" xsi:nil="true"/>
-    <MediaServiceKeyPoints xmlns="71af3243-3dd4-4a8d-8c0d-dd76da1f02a5" xsi:nil="true"/>
-  </documentManagement>
-</p:properties>
+<?mso-contentType ?>
+<FormTemplates xmlns="http://schemas.microsoft.com/sharepoint/v3/contenttype/forms">
+  <Display>DocumentLibraryForm</Display>
+  <Edit>DocumentLibraryForm</Edit>
+  <New>DocumentLibraryForm</New>
+</FormTemplates>
 </file>
 
 <file path=customXml/item2.xml><?xml version="1.0" encoding="utf-8"?>
-<b:Sources xmlns:b="http://schemas.openxmlformats.org/officeDocument/2006/bibliography" xmlns="http://schemas.openxmlformats.org/officeDocument/2006/bibliography" SelectedStyle="\APASixthEditionOfficeOnline.xsl" StyleName="APA" Version="6"/>
-</file>
-
-<file path=customXml/item3.xml><?xml version="1.0" encoding="utf-8"?>
 <ct:contentTypeSchema xmlns:ct="http://schemas.microsoft.com/office/2006/metadata/contentType" xmlns:ma="http://schemas.microsoft.com/office/2006/metadata/properties/metaAttributes" ct:_="" ma:_="" ma:contentTypeName="Document" ma:contentTypeID="0x01010079F111ED35F8CC479449609E8A0923A6" ma:contentTypeVersion="26" ma:contentTypeDescription="Create a new document." ma:contentTypeScope="" ma:versionID="ac37c1753acd5e330d2062ccec26ea66">
   <xsd:schema xmlns:xsd="http://www.w3.org/2001/XMLSchema" xmlns:xs="http://www.w3.org/2001/XMLSchema" xmlns:p="http://schemas.microsoft.com/office/2006/metadata/properties" xmlns:ns1="http://schemas.microsoft.com/sharepoint/v3" xmlns:ns2="71af3243-3dd4-4a8d-8c0d-dd76da1f02a5" xmlns:ns3="16c05727-aa75-4e4a-9b5f-8a80a1165891" xmlns:ns4="230e9df3-be65-4c73-a93b-d1236ebd677e" targetNamespace="http://schemas.microsoft.com/office/2006/metadata/properties" ma:root="true" ma:fieldsID="3b340c7101c92c5120abd06486f94548" ns1:_="" ns2:_="" ns3:_="" ns4:_="">
     <xsd:import namespace="http://schemas.microsoft.com/sharepoint/v3"/>
@@ -29551,36 +27784,39 @@
 </ct:contentTypeSchema>
 </file>
 
+<file path=customXml/item3.xml><?xml version="1.0" encoding="utf-8"?>
+<b:Sources xmlns:b="http://schemas.openxmlformats.org/officeDocument/2006/bibliography" xmlns="http://schemas.openxmlformats.org/officeDocument/2006/bibliography" SelectedStyle="\APASixthEditionOfficeOnline.xsl" StyleName="APA" Version="6"/>
+</file>
+
 <file path=customXml/item4.xml><?xml version="1.0" encoding="utf-8"?>
-<?mso-contentType ?>
-<FormTemplates xmlns="http://schemas.microsoft.com/sharepoint/v3/contenttype/forms">
-  <Display>DocumentLibraryForm</Display>
-  <Edit>DocumentLibraryForm</Edit>
-  <New>DocumentLibraryForm</New>
-</FormTemplates>
+<p:properties xmlns:p="http://schemas.microsoft.com/office/2006/metadata/properties" xmlns:xsi="http://www.w3.org/2001/XMLSchema-instance" xmlns:pc="http://schemas.microsoft.com/office/infopath/2007/PartnerControls">
+  <documentManagement>
+    <_ip_UnifiedCompliancePolicyUIAction xmlns="http://schemas.microsoft.com/sharepoint/v3" xsi:nil="true"/>
+    <Image xmlns="71af3243-3dd4-4a8d-8c0d-dd76da1f02a5">
+      <Url xsi:nil="true"/>
+      <Description xsi:nil="true"/>
+    </Image>
+    <Status xmlns="71af3243-3dd4-4a8d-8c0d-dd76da1f02a5">Not started</Status>
+    <Background xmlns="71af3243-3dd4-4a8d-8c0d-dd76da1f02a5">false</Background>
+    <_ip_UnifiedCompliancePolicyProperties xmlns="http://schemas.microsoft.com/sharepoint/v3" xsi:nil="true"/>
+    <ImageTagsTaxHTField xmlns="71af3243-3dd4-4a8d-8c0d-dd76da1f02a5">
+      <Terms xmlns="http://schemas.microsoft.com/office/infopath/2007/PartnerControls"/>
+    </ImageTagsTaxHTField>
+    <TaxCatchAll xmlns="230e9df3-be65-4c73-a93b-d1236ebd677e" xsi:nil="true"/>
+    <MediaServiceKeyPoints xmlns="71af3243-3dd4-4a8d-8c0d-dd76da1f02a5" xsi:nil="true"/>
+  </documentManagement>
+</p:properties>
 </file>
 
 <file path=customXml/itemProps1.xml><?xml version="1.0" encoding="utf-8"?>
-<ds:datastoreItem xmlns:ds="http://schemas.openxmlformats.org/officeDocument/2006/customXml" ds:itemID="{C7DCE20C-610A-4626-841D-1F10857B445E}">
+<ds:datastoreItem xmlns:ds="http://schemas.openxmlformats.org/officeDocument/2006/customXml" ds:itemID="{2D686CB8-6245-413C-A355-156513A377FC}">
   <ds:schemaRefs>
-    <ds:schemaRef ds:uri="http://schemas.microsoft.com/office/2006/metadata/properties"/>
-    <ds:schemaRef ds:uri="http://schemas.microsoft.com/office/infopath/2007/PartnerControls"/>
-    <ds:schemaRef ds:uri="http://schemas.microsoft.com/sharepoint/v3"/>
-    <ds:schemaRef ds:uri="71af3243-3dd4-4a8d-8c0d-dd76da1f02a5"/>
-    <ds:schemaRef ds:uri="230e9df3-be65-4c73-a93b-d1236ebd677e"/>
+    <ds:schemaRef ds:uri="http://schemas.microsoft.com/sharepoint/v3/contenttype/forms"/>
   </ds:schemaRefs>
 </ds:datastoreItem>
 </file>
 
 <file path=customXml/itemProps2.xml><?xml version="1.0" encoding="utf-8"?>
-<ds:datastoreItem xmlns:ds="http://schemas.openxmlformats.org/officeDocument/2006/customXml" ds:itemID="{F9D8BAEF-754A-4A5B-9842-7C6F5475FE1D}">
-  <ds:schemaRefs>
-    <ds:schemaRef ds:uri="http://schemas.openxmlformats.org/officeDocument/2006/bibliography"/>
-  </ds:schemaRefs>
-</ds:datastoreItem>
-</file>
-
-<file path=customXml/itemProps3.xml><?xml version="1.0" encoding="utf-8"?>
 <ds:datastoreItem xmlns:ds="http://schemas.openxmlformats.org/officeDocument/2006/customXml" ds:itemID="{3B411A11-DDA3-4BC4-B0BC-14026E6D5DF4}">
   <ds:schemaRefs>
     <ds:schemaRef ds:uri="http://schemas.microsoft.com/office/2006/metadata/contentType"/>
@@ -29601,10 +27837,22 @@
 </ds:datastoreItem>
 </file>
 
+<file path=customXml/itemProps3.xml><?xml version="1.0" encoding="utf-8"?>
+<ds:datastoreItem xmlns:ds="http://schemas.openxmlformats.org/officeDocument/2006/customXml" ds:itemID="{F9D8BAEF-754A-4A5B-9842-7C6F5475FE1D}">
+  <ds:schemaRefs>
+    <ds:schemaRef ds:uri="http://schemas.openxmlformats.org/officeDocument/2006/bibliography"/>
+  </ds:schemaRefs>
+</ds:datastoreItem>
+</file>
+
 <file path=customXml/itemProps4.xml><?xml version="1.0" encoding="utf-8"?>
-<ds:datastoreItem xmlns:ds="http://schemas.openxmlformats.org/officeDocument/2006/customXml" ds:itemID="{2D686CB8-6245-413C-A355-156513A377FC}">
+<ds:datastoreItem xmlns:ds="http://schemas.openxmlformats.org/officeDocument/2006/customXml" ds:itemID="{C7DCE20C-610A-4626-841D-1F10857B445E}">
   <ds:schemaRefs>
-    <ds:schemaRef ds:uri="http://schemas.microsoft.com/sharepoint/v3/contenttype/forms"/>
+    <ds:schemaRef ds:uri="http://schemas.microsoft.com/office/2006/metadata/properties"/>
+    <ds:schemaRef ds:uri="http://schemas.microsoft.com/office/infopath/2007/PartnerControls"/>
+    <ds:schemaRef ds:uri="http://schemas.microsoft.com/sharepoint/v3"/>
+    <ds:schemaRef ds:uri="71af3243-3dd4-4a8d-8c0d-dd76da1f02a5"/>
+    <ds:schemaRef ds:uri="230e9df3-be65-4c73-a93b-d1236ebd677e"/>
   </ds:schemaRefs>
 </ds:datastoreItem>
 </file>
</xml_diff>